<commit_message>
Update logs and md files
</commit_message>
<xml_diff>
--- a/web/index.docx
+++ b/web/index.docx
@@ -189,7 +189,7 @@
       </w:pPr>
       <w:bookmarkStart w:id="15" w:name="_education"/>
       <w:r>
-        <w:t xml:space="preserve">EDUCATION</w:t>
+        <w:t xml:space="preserve">Education</w:t>
       </w:r>
       <w:bookmarkEnd w:id="15"/>
     </w:p>
@@ -629,6 +629,9 @@
       </w:r>
       <w:r>
         <w:t xml:space="preserve">, Safwat Hassan, Ying Zou, Derek Truong, Toby Corbin. Enhancing performance bug prediction using performance code metrics. In 21st International Conference on Mining Software Repositories: Technical Track, MSR ’24.</w:t>
+      </w:r>
+      <w:r>
+        <w:t xml:space="preserve"> </w:t>
       </w:r>
     </w:p>
     <w:p>

</xml_diff>

<commit_message>
Add missing references for publications
</commit_message>
<xml_diff>
--- a/web/index.docx
+++ b/web/index.docx
@@ -76,7 +76,7 @@
         <w:t xml:space="preserve">About me</w:t>
       </w:r>
       <w:r>
-        <w:t xml:space="preserve">: I am passionated with research,</w:t>
+        <w:t xml:space="preserve">: I am passionate about research,</w:t>
       </w:r>
       <w:r>
         <w:t xml:space="preserve"> </w:t>
@@ -90,7 +90,7 @@
         </w:r>
       </w:hyperlink>
       <w:r>
-        <w:t xml:space="preserve">, integrating new technologies, and automating cumbersome tasks. My research interests lie to Green and Energy-Efficient Computing, Mining Software Repositories, and Machine Learning. I enjoy working on the command-line and especially with Linux systems. I love to create small indepentant componets and tools to facilitate different daily functionalities. On my free time, I enjoy sporting, reading books, and</w:t>
+        <w:t xml:space="preserve">, exploring emerging technologies, and automating repetitive and time-consuming tasks. My research interests include Green and Energy-Efficient Computing, Mining Software Repositories, and Machine Learning. I enjoy working at the command line, particularly in Linux environments, and developing small, independent components and tools that simplify everyday tasks and improve productivity. I am always eager to learn, experiment with new technologies, and build practical solutions to real-world problems. In my free time, I enjoy sports, reading books, and</w:t>
       </w:r>
       <w:r>
         <w:t xml:space="preserve"> </w:t>
@@ -633,6 +633,23 @@
       <w:r>
         <w:t xml:space="preserve"> </w:t>
       </w:r>
+      <w:r>
+        <w:t xml:space="preserve"> </w:t>
+      </w:r>
+      <w:r>
+        <w:t xml:space="preserve">[</w:t>
+      </w:r>
+      <w:hyperlink r:id="rId27">
+        <w:r>
+          <w:rPr>
+            <w:rStyle w:val="Hyperlink"/>
+          </w:rPr>
+          <w:t xml:space="preserve">Link</w:t>
+        </w:r>
+      </w:hyperlink>
+      <w:r>
+        <w:t xml:space="preserve">]</w:t>
+      </w:r>
     </w:p>
     <w:p>
       <w:pPr>
@@ -661,23 +678,34 @@
       <w:r>
         <w:t xml:space="preserve">[</w:t>
       </w:r>
-      <w:hyperlink r:id="rId27">
-        <w:r>
-          <w:rPr>
-            <w:rStyle w:val="Hyperlink"/>
-          </w:rPr>
-          <w:t xml:space="preserve">Paper</w:t>
+      <w:hyperlink r:id="rId28">
+        <w:r>
+          <w:rPr>
+            <w:rStyle w:val="Hyperlink"/>
+          </w:rPr>
+          <w:t xml:space="preserve">Link</w:t>
         </w:r>
       </w:hyperlink>
       <w:r>
         <w:t xml:space="preserve">] [</w:t>
       </w:r>
-      <w:hyperlink r:id="rId28">
-        <w:r>
-          <w:rPr>
-            <w:rStyle w:val="Hyperlink"/>
-          </w:rPr>
-          <w:t xml:space="preserve">BibTex</w:t>
+      <w:hyperlink r:id="rId29">
+        <w:r>
+          <w:rPr>
+            <w:rStyle w:val="Hyperlink"/>
+          </w:rPr>
+          <w:t xml:space="preserve">Presentation</w:t>
+        </w:r>
+      </w:hyperlink>
+      <w:r>
+        <w:t xml:space="preserve">] [</w:t>
+      </w:r>
+      <w:hyperlink r:id="rId30">
+        <w:r>
+          <w:rPr>
+            <w:rStyle w:val="Hyperlink"/>
+          </w:rPr>
+          <w:t xml:space="preserve">Data-set</w:t>
         </w:r>
       </w:hyperlink>
       <w:r>
@@ -711,40 +739,29 @@
       <w:r>
         <w:t xml:space="preserve">[</w:t>
       </w:r>
-      <w:hyperlink r:id="rId29">
-        <w:r>
-          <w:rPr>
-            <w:rStyle w:val="Hyperlink"/>
-          </w:rPr>
-          <w:t xml:space="preserve">Paper</w:t>
+      <w:hyperlink r:id="rId31">
+        <w:r>
+          <w:rPr>
+            <w:rStyle w:val="Hyperlink"/>
+          </w:rPr>
+          <w:t xml:space="preserve">Link</w:t>
         </w:r>
       </w:hyperlink>
       <w:r>
         <w:t xml:space="preserve">] [</w:t>
       </w:r>
-      <w:hyperlink r:id="rId30">
-        <w:r>
-          <w:rPr>
-            <w:rStyle w:val="Hyperlink"/>
-          </w:rPr>
-          <w:t xml:space="preserve">BibTex</w:t>
+      <w:hyperlink r:id="rId32">
+        <w:r>
+          <w:rPr>
+            <w:rStyle w:val="Hyperlink"/>
+          </w:rPr>
+          <w:t xml:space="preserve">Presentation</w:t>
         </w:r>
       </w:hyperlink>
       <w:r>
         <w:t xml:space="preserve">] [</w:t>
       </w:r>
-      <w:hyperlink r:id="rId31">
-        <w:r>
-          <w:rPr>
-            <w:rStyle w:val="Hyperlink"/>
-          </w:rPr>
-          <w:t xml:space="preserve">Presentation</w:t>
-        </w:r>
-      </w:hyperlink>
-      <w:r>
-        <w:t xml:space="preserve">] [</w:t>
-      </w:r>
-      <w:hyperlink r:id="rId32">
+      <w:hyperlink r:id="rId33">
         <w:r>
           <w:rPr>
             <w:rStyle w:val="Hyperlink"/>
@@ -783,40 +800,29 @@
       <w:r>
         <w:t xml:space="preserve">[</w:t>
       </w:r>
+      <w:hyperlink r:id="rId34">
+        <w:r>
+          <w:rPr>
+            <w:rStyle w:val="Hyperlink"/>
+          </w:rPr>
+          <w:t xml:space="preserve">Link</w:t>
+        </w:r>
+      </w:hyperlink>
+      <w:r>
+        <w:t xml:space="preserve">] [</w:t>
+      </w:r>
+      <w:hyperlink r:id="rId35">
+        <w:r>
+          <w:rPr>
+            <w:rStyle w:val="Hyperlink"/>
+          </w:rPr>
+          <w:t xml:space="preserve">Presentation</w:t>
+        </w:r>
+      </w:hyperlink>
+      <w:r>
+        <w:t xml:space="preserve">] [</w:t>
+      </w:r>
       <w:hyperlink r:id="rId33">
-        <w:r>
-          <w:rPr>
-            <w:rStyle w:val="Hyperlink"/>
-          </w:rPr>
-          <w:t xml:space="preserve">Paper</w:t>
-        </w:r>
-      </w:hyperlink>
-      <w:r>
-        <w:t xml:space="preserve">] [</w:t>
-      </w:r>
-      <w:hyperlink r:id="rId34">
-        <w:r>
-          <w:rPr>
-            <w:rStyle w:val="Hyperlink"/>
-          </w:rPr>
-          <w:t xml:space="preserve">BibTex</w:t>
-        </w:r>
-      </w:hyperlink>
-      <w:r>
-        <w:t xml:space="preserve">] [</w:t>
-      </w:r>
-      <w:hyperlink r:id="rId35">
-        <w:r>
-          <w:rPr>
-            <w:rStyle w:val="Hyperlink"/>
-          </w:rPr>
-          <w:t xml:space="preserve">Presentation</w:t>
-        </w:r>
-      </w:hyperlink>
-      <w:r>
-        <w:t xml:space="preserve">] [</w:t>
-      </w:r>
-      <w:hyperlink r:id="rId32">
         <w:r>
           <w:rPr>
             <w:rStyle w:val="Hyperlink"/>
@@ -892,6 +898,23 @@
       <w:r>
         <w:t xml:space="preserve">, Ying Zou. An empirical study of refactoring rhythms and tactics in the software development process. Accepted for publication in Transactions on Software Engineering.</w:t>
       </w:r>
+      <w:r>
+        <w:t xml:space="preserve"> </w:t>
+      </w:r>
+      <w:r>
+        <w:t xml:space="preserve">[</w:t>
+      </w:r>
+      <w:hyperlink r:id="rId36">
+        <w:r>
+          <w:rPr>
+            <w:rStyle w:val="Hyperlink"/>
+          </w:rPr>
+          <w:t xml:space="preserve">Link</w:t>
+        </w:r>
+      </w:hyperlink>
+      <w:r>
+        <w:t xml:space="preserve">]</w:t>
+      </w:r>
     </w:p>
     <w:p>
       <w:pPr>
@@ -920,6 +943,23 @@
       <w:r>
         <w:t xml:space="preserve"> </w:t>
       </w:r>
+      <w:r>
+        <w:t xml:space="preserve"> </w:t>
+      </w:r>
+      <w:r>
+        <w:t xml:space="preserve">[</w:t>
+      </w:r>
+      <w:hyperlink r:id="rId37">
+        <w:r>
+          <w:rPr>
+            <w:rStyle w:val="Hyperlink"/>
+          </w:rPr>
+          <w:t xml:space="preserve">Link</w:t>
+        </w:r>
+      </w:hyperlink>
+      <w:r>
+        <w:t xml:space="preserve">]</w:t>
+      </w:r>
     </w:p>
     <w:p>
       <w:pPr>
@@ -948,6 +988,23 @@
       <w:r>
         <w:t xml:space="preserve"> </w:t>
       </w:r>
+      <w:r>
+        <w:t xml:space="preserve"> </w:t>
+      </w:r>
+      <w:r>
+        <w:t xml:space="preserve">[</w:t>
+      </w:r>
+      <w:hyperlink r:id="rId38">
+        <w:r>
+          <w:rPr>
+            <w:rStyle w:val="Hyperlink"/>
+          </w:rPr>
+          <w:t xml:space="preserve">Link</w:t>
+        </w:r>
+      </w:hyperlink>
+      <w:r>
+        <w:t xml:space="preserve">]</w:t>
+      </w:r>
     </w:p>
     <w:p>
       <w:pPr>
@@ -1001,23 +1058,12 @@
       <w:r>
         <w:t xml:space="preserve">[</w:t>
       </w:r>
-      <w:hyperlink r:id="rId36">
-        <w:r>
-          <w:rPr>
-            <w:rStyle w:val="Hyperlink"/>
-          </w:rPr>
-          <w:t xml:space="preserve">Preprint</w:t>
-        </w:r>
-      </w:hyperlink>
-      <w:r>
-        <w:t xml:space="preserve">] [</w:t>
-      </w:r>
-      <w:hyperlink r:id="rId37">
-        <w:r>
-          <w:rPr>
-            <w:rStyle w:val="Hyperlink"/>
-          </w:rPr>
-          <w:t xml:space="preserve">BibTex</w:t>
+      <w:hyperlink r:id="rId39">
+        <w:r>
+          <w:rPr>
+            <w:rStyle w:val="Hyperlink"/>
+          </w:rPr>
+          <w:t xml:space="preserve">Link</w:t>
         </w:r>
       </w:hyperlink>
       <w:r>
@@ -1051,23 +1097,12 @@
       <w:r>
         <w:t xml:space="preserve">[</w:t>
       </w:r>
-      <w:hyperlink r:id="rId38">
-        <w:r>
-          <w:rPr>
-            <w:rStyle w:val="Hyperlink"/>
-          </w:rPr>
-          <w:t xml:space="preserve">Preprint</w:t>
-        </w:r>
-      </w:hyperlink>
-      <w:r>
-        <w:t xml:space="preserve">] [</w:t>
-      </w:r>
-      <w:hyperlink r:id="rId39">
-        <w:r>
-          <w:rPr>
-            <w:rStyle w:val="Hyperlink"/>
-          </w:rPr>
-          <w:t xml:space="preserve">BibTex</w:t>
+      <w:hyperlink r:id="rId40">
+        <w:r>
+          <w:rPr>
+            <w:rStyle w:val="Hyperlink"/>
+          </w:rPr>
+          <w:t xml:space="preserve">Link</w:t>
         </w:r>
       </w:hyperlink>
       <w:r>
@@ -1078,11 +1113,11 @@
       <w:pPr>
         <w:pStyle w:val="Heading2"/>
       </w:pPr>
-      <w:bookmarkStart w:id="40" w:name="_e5bd27a4a70528ddbc4c12eea3c9eca69cfa426"/>
+      <w:bookmarkStart w:id="41" w:name="_e5bd27a4a70528ddbc4c12eea3c9eca69cfa426"/>
       <w:r>
         <w:t xml:space="preserve">Organization Services</w:t>
       </w:r>
-      <w:bookmarkEnd w:id="40"/>
+      <w:bookmarkEnd w:id="41"/>
     </w:p>
     <w:p>
       <w:pPr>
@@ -1188,11 +1223,11 @@
       <w:pPr>
         <w:pStyle w:val="Heading2"/>
       </w:pPr>
-      <w:bookmarkStart w:id="41" w:name="_d92adb52484a714afc99a8491ccb75f3bf3313e"/>
+      <w:bookmarkStart w:id="42" w:name="_d92adb52484a714afc99a8491ccb75f3bf3313e"/>
       <w:r>
         <w:t xml:space="preserve">Invited Talks</w:t>
       </w:r>
-      <w:bookmarkEnd w:id="41"/>
+      <w:bookmarkEnd w:id="42"/>
     </w:p>
     <w:p>
       <w:pPr>
@@ -1222,7 +1257,7 @@
       <w:r>
         <w:t xml:space="preserve"> </w:t>
       </w:r>
-      <w:hyperlink r:id="rId42">
+      <w:hyperlink r:id="rId43">
         <w:r>
           <w:rPr>
             <w:rStyle w:val="Hyperlink"/>
@@ -1251,7 +1286,7 @@
       <w:r>
         <w:t xml:space="preserve"> </w:t>
       </w:r>
-      <w:hyperlink r:id="rId43">
+      <w:hyperlink r:id="rId44">
         <w:r>
           <w:rPr>
             <w:rStyle w:val="Hyperlink"/>
@@ -1288,7 +1323,7 @@
       <w:r>
         <w:t xml:space="preserve"> </w:t>
       </w:r>
-      <w:hyperlink r:id="rId44">
+      <w:hyperlink r:id="rId45">
         <w:r>
           <w:rPr>
             <w:rStyle w:val="Hyperlink"/>
@@ -1299,7 +1334,7 @@
       <w:r>
         <w:t xml:space="preserve"> </w:t>
       </w:r>
-      <w:hyperlink r:id="rId45">
+      <w:hyperlink r:id="rId46">
         <w:r>
           <w:rPr>
             <w:rStyle w:val="Hyperlink"/>
@@ -1328,7 +1363,7 @@
       <w:r>
         <w:t xml:space="preserve"> </w:t>
       </w:r>
-      <w:hyperlink r:id="rId46">
+      <w:hyperlink r:id="rId47">
         <w:r>
           <w:rPr>
             <w:rStyle w:val="Hyperlink"/>
@@ -1341,11 +1376,11 @@
       <w:pPr>
         <w:pStyle w:val="Heading2"/>
       </w:pPr>
-      <w:bookmarkStart w:id="47" w:name="_6a59066c3a6e5df6600690f250943ddabffdd1a"/>
+      <w:bookmarkStart w:id="48" w:name="_6a59066c3a6e5df6600690f250943ddabffdd1a"/>
       <w:r>
         <w:t xml:space="preserve">Teaching Experience</w:t>
       </w:r>
-      <w:bookmarkEnd w:id="47"/>
+      <w:bookmarkEnd w:id="48"/>
     </w:p>
     <w:p>
       <w:pPr>
@@ -1362,7 +1397,7 @@
       <w:r>
         <w:t xml:space="preserve">Assisting my PhD advisor at Programming II course (Winter Semester of 2016, 2017, and 2018) by giving tutorial and Lab sessions in Java [</w:t>
       </w:r>
-      <w:hyperlink r:id="rId48">
+      <w:hyperlink r:id="rId49">
         <w:r>
           <w:rPr>
             <w:rStyle w:val="Hyperlink"/>
@@ -1390,7 +1425,7 @@
       <w:r>
         <w:t xml:space="preserve">[</w:t>
       </w:r>
-      <w:hyperlink r:id="rId49">
+      <w:hyperlink r:id="rId50">
         <w:r>
           <w:rPr>
             <w:rStyle w:val="Hyperlink"/>
@@ -1401,7 +1436,7 @@
       <w:r>
         <w:t xml:space="preserve">] [</w:t>
       </w:r>
-      <w:hyperlink r:id="rId50">
+      <w:hyperlink r:id="rId51">
         <w:r>
           <w:rPr>
             <w:rStyle w:val="Hyperlink"/>
@@ -1417,11 +1452,11 @@
       <w:pPr>
         <w:pStyle w:val="Heading2"/>
       </w:pPr>
-      <w:bookmarkStart w:id="51" w:name="_06c59885f23e3f8e077b05402aa304ce183fabc"/>
+      <w:bookmarkStart w:id="52" w:name="_06c59885f23e3f8e077b05402aa304ce183fabc"/>
       <w:r>
         <w:t xml:space="preserve">Developer Working Experience</w:t>
       </w:r>
-      <w:bookmarkEnd w:id="51"/>
+      <w:bookmarkEnd w:id="52"/>
     </w:p>
     <w:p>
       <w:pPr>
@@ -1451,7 +1486,7 @@
       <w:r>
         <w:t xml:space="preserve"> </w:t>
       </w:r>
-      <w:hyperlink r:id="rId52">
+      <w:hyperlink r:id="rId53">
         <w:r>
           <w:rPr>
             <w:rStyle w:val="Hyperlink"/>
@@ -1480,7 +1515,7 @@
       <w:r>
         <w:t xml:space="preserve"> </w:t>
       </w:r>
-      <w:hyperlink r:id="rId53">
+      <w:hyperlink r:id="rId54">
         <w:r>
           <w:rPr>
             <w:rStyle w:val="Hyperlink"/>
@@ -1509,7 +1544,7 @@
       <w:r>
         <w:t xml:space="preserve"> </w:t>
       </w:r>
-      <w:hyperlink r:id="rId54">
+      <w:hyperlink r:id="rId55">
         <w:r>
           <w:rPr>
             <w:rStyle w:val="Hyperlink"/>
@@ -1538,7 +1573,7 @@
       <w:r>
         <w:t xml:space="preserve"> </w:t>
       </w:r>
-      <w:hyperlink r:id="rId55">
+      <w:hyperlink r:id="rId56">
         <w:r>
           <w:rPr>
             <w:rStyle w:val="Hyperlink"/>
@@ -1575,7 +1610,7 @@
       <w:r>
         <w:t xml:space="preserve"> </w:t>
       </w:r>
-      <w:hyperlink r:id="rId56">
+      <w:hyperlink r:id="rId57">
         <w:r>
           <w:rPr>
             <w:rStyle w:val="Hyperlink"/>
@@ -1612,7 +1647,7 @@
       <w:r>
         <w:t xml:space="preserve"> </w:t>
       </w:r>
-      <w:hyperlink r:id="rId57">
+      <w:hyperlink r:id="rId58">
         <w:r>
           <w:rPr>
             <w:rStyle w:val="Hyperlink"/>
@@ -1653,7 +1688,7 @@
       <w:r>
         <w:t xml:space="preserve"> </w:t>
       </w:r>
-      <w:hyperlink r:id="rId58">
+      <w:hyperlink r:id="rId59">
         <w:r>
           <w:rPr>
             <w:rStyle w:val="Hyperlink"/>
@@ -1670,7 +1705,7 @@
       <w:r>
         <w:t xml:space="preserve"> </w:t>
       </w:r>
-      <w:hyperlink r:id="rId59">
+      <w:hyperlink r:id="rId60">
         <w:r>
           <w:rPr>
             <w:rStyle w:val="Hyperlink"/>
@@ -1711,7 +1746,7 @@
       <w:r>
         <w:t xml:space="preserve"> </w:t>
       </w:r>
-      <w:hyperlink r:id="rId60">
+      <w:hyperlink r:id="rId61">
         <w:r>
           <w:rPr>
             <w:rStyle w:val="Hyperlink"/>
@@ -1752,7 +1787,7 @@
       <w:r>
         <w:t xml:space="preserve"> </w:t>
       </w:r>
-      <w:hyperlink r:id="rId61">
+      <w:hyperlink r:id="rId62">
         <w:r>
           <w:rPr>
             <w:rStyle w:val="Hyperlink"/>
@@ -1863,7 +1898,7 @@
       <w:r>
         <w:t xml:space="preserve"> </w:t>
       </w:r>
-      <w:hyperlink r:id="rId62">
+      <w:hyperlink r:id="rId63">
         <w:r>
           <w:rPr>
             <w:rStyle w:val="Hyperlink"/>
@@ -1892,7 +1927,7 @@
       <w:r>
         <w:t xml:space="preserve"> </w:t>
       </w:r>
-      <w:hyperlink r:id="rId63">
+      <w:hyperlink r:id="rId64">
         <w:r>
           <w:rPr>
             <w:rStyle w:val="Hyperlink"/>
@@ -1903,7 +1938,7 @@
       <w:r>
         <w:t xml:space="preserve"> </w:t>
       </w:r>
-      <w:hyperlink r:id="rId64">
+      <w:hyperlink r:id="rId65">
         <w:r>
           <w:rPr>
             <w:rStyle w:val="Hyperlink"/>
@@ -1926,7 +1961,7 @@
       <w:r>
         <w:t xml:space="preserve"> </w:t>
       </w:r>
-      <w:hyperlink r:id="rId65">
+      <w:hyperlink r:id="rId66">
         <w:r>
           <w:rPr>
             <w:rStyle w:val="Hyperlink"/>
@@ -1940,7 +1975,7 @@
       <w:r>
         <w:t xml:space="preserve"> </w:t>
       </w:r>
-      <w:hyperlink r:id="rId66">
+      <w:hyperlink r:id="rId67">
         <w:r>
           <w:rPr>
             <w:rStyle w:val="Hyperlink"/>
@@ -1954,7 +1989,7 @@
       <w:r>
         <w:t xml:space="preserve"> </w:t>
       </w:r>
-      <w:hyperlink r:id="rId67">
+      <w:hyperlink r:id="rId68">
         <w:r>
           <w:rPr>
             <w:rStyle w:val="Hyperlink"/>
@@ -1997,7 +2032,7 @@
       <w:r>
         <w:t xml:space="preserve"> </w:t>
       </w:r>
-      <w:hyperlink r:id="rId68">
+      <w:hyperlink r:id="rId69">
         <w:r>
           <w:rPr>
             <w:rStyle w:val="Hyperlink"/>
@@ -2016,7 +2051,7 @@
       <w:r>
         <w:t xml:space="preserve"> </w:t>
       </w:r>
-      <w:hyperlink r:id="rId69">
+      <w:hyperlink r:id="rId70">
         <w:r>
           <w:rPr>
             <w:rStyle w:val="Hyperlink"/>
@@ -2052,7 +2087,7 @@
       <w:r>
         <w:t xml:space="preserve"> </w:t>
       </w:r>
-      <w:hyperlink r:id="rId57">
+      <w:hyperlink r:id="rId58">
         <w:r>
           <w:rPr>
             <w:rStyle w:val="Hyperlink"/>
@@ -2069,7 +2104,7 @@
       <w:r>
         <w:t xml:space="preserve"> </w:t>
       </w:r>
-      <w:hyperlink r:id="rId70">
+      <w:hyperlink r:id="rId71">
         <w:r>
           <w:rPr>
             <w:rStyle w:val="Hyperlink"/>
@@ -2098,7 +2133,7 @@
       <w:r>
         <w:t xml:space="preserve"> </w:t>
       </w:r>
-      <w:hyperlink r:id="rId71">
+      <w:hyperlink r:id="rId72">
         <w:r>
           <w:rPr>
             <w:rStyle w:val="Hyperlink"/>
@@ -2112,7 +2147,7 @@
       <w:r>
         <w:t xml:space="preserve"> </w:t>
       </w:r>
-      <w:hyperlink r:id="rId72">
+      <w:hyperlink r:id="rId73">
         <w:r>
           <w:rPr>
             <w:rStyle w:val="Hyperlink"/>
@@ -2129,7 +2164,7 @@
       <w:r>
         <w:t xml:space="preserve"> </w:t>
       </w:r>
-      <w:hyperlink r:id="rId73">
+      <w:hyperlink r:id="rId74">
         <w:r>
           <w:rPr>
             <w:rStyle w:val="Hyperlink"/>
@@ -2146,7 +2181,7 @@
       <w:r>
         <w:t xml:space="preserve"> </w:t>
       </w:r>
-      <w:hyperlink r:id="rId74">
+      <w:hyperlink r:id="rId75">
         <w:r>
           <w:rPr>
             <w:rStyle w:val="Hyperlink"/>
@@ -2172,7 +2207,7 @@
       <w:r>
         <w:t xml:space="preserve"> </w:t>
       </w:r>
-      <w:hyperlink r:id="rId75">
+      <w:hyperlink r:id="rId76">
         <w:r>
           <w:rPr>
             <w:rStyle w:val="Hyperlink"/>
@@ -2186,7 +2221,7 @@
       <w:r>
         <w:t xml:space="preserve"> </w:t>
       </w:r>
-      <w:hyperlink r:id="rId76">
+      <w:hyperlink r:id="rId77">
         <w:r>
           <w:rPr>
             <w:rStyle w:val="Hyperlink"/>
@@ -2200,7 +2235,7 @@
       <w:r>
         <w:t xml:space="preserve"> </w:t>
       </w:r>
-      <w:hyperlink r:id="rId77">
+      <w:hyperlink r:id="rId78">
         <w:r>
           <w:rPr>
             <w:rStyle w:val="Hyperlink"/>
@@ -2226,7 +2261,7 @@
       <w:r>
         <w:t xml:space="preserve"> </w:t>
       </w:r>
-      <w:hyperlink r:id="rId78">
+      <w:hyperlink r:id="rId79">
         <w:r>
           <w:rPr>
             <w:rStyle w:val="Hyperlink"/>
@@ -2243,7 +2278,7 @@
       <w:r>
         <w:t xml:space="preserve"> </w:t>
       </w:r>
-      <w:hyperlink r:id="rId79">
+      <w:hyperlink r:id="rId80">
         <w:r>
           <w:rPr>
             <w:rStyle w:val="Hyperlink"/>
@@ -2280,7 +2315,7 @@
       <w:r>
         <w:t xml:space="preserve"> </w:t>
       </w:r>
-      <w:hyperlink r:id="rId80">
+      <w:hyperlink r:id="rId81">
         <w:r>
           <w:rPr>
             <w:rStyle w:val="Hyperlink"/>
@@ -2312,7 +2347,7 @@
       <w:r>
         <w:t xml:space="preserve"> </w:t>
       </w:r>
-      <w:hyperlink r:id="rId81">
+      <w:hyperlink r:id="rId82">
         <w:r>
           <w:rPr>
             <w:rStyle w:val="Hyperlink"/>
@@ -2325,11 +2360,11 @@
       <w:pPr>
         <w:pStyle w:val="Heading2"/>
       </w:pPr>
-      <w:bookmarkStart w:id="82" w:name="_b3cbc0e99ad15217bce1933e8c79845e37f6c1f"/>
+      <w:bookmarkStart w:id="83" w:name="_b3cbc0e99ad15217bce1933e8c79845e37f6c1f"/>
       <w:r>
         <w:t xml:space="preserve">TECH SKILLSET</w:t>
       </w:r>
-      <w:bookmarkEnd w:id="82"/>
+      <w:bookmarkEnd w:id="83"/>
     </w:p>
     <w:p>
       <w:pPr>
@@ -2481,7 +2516,7 @@
       <w:r>
         <w:t xml:space="preserve"> </w:t>
       </w:r>
-      <w:hyperlink r:id="rId83">
+      <w:hyperlink r:id="rId84">
         <w:r>
           <w:rPr>
             <w:rStyle w:val="Hyperlink"/>
@@ -2503,7 +2538,7 @@
       <w:r>
         <w:t xml:space="preserve"> </w:t>
       </w:r>
-      <w:hyperlink r:id="rId84">
+      <w:hyperlink r:id="rId85">
         <w:r>
           <w:rPr>
             <w:rStyle w:val="Hyperlink"/>
@@ -2517,7 +2552,7 @@
       <w:r>
         <w:t xml:space="preserve"> </w:t>
       </w:r>
-      <w:hyperlink r:id="rId85">
+      <w:hyperlink r:id="rId86">
         <w:r>
           <w:rPr>
             <w:rStyle w:val="Hyperlink"/>
@@ -2531,7 +2566,7 @@
       <w:r>
         <w:t xml:space="preserve"> </w:t>
       </w:r>
-      <w:hyperlink r:id="rId86">
+      <w:hyperlink r:id="rId87">
         <w:r>
           <w:rPr>
             <w:rStyle w:val="Hyperlink"/>
@@ -2545,7 +2580,7 @@
       <w:r>
         <w:t xml:space="preserve"> </w:t>
       </w:r>
-      <w:hyperlink r:id="rId87">
+      <w:hyperlink r:id="rId88">
         <w:r>
           <w:rPr>
             <w:rStyle w:val="Hyperlink"/>
@@ -2574,11 +2609,11 @@
       <w:pPr>
         <w:pStyle w:val="Heading2"/>
       </w:pPr>
-      <w:bookmarkStart w:id="88" w:name="_f1cfe2fb9a977f042a75385d7e73a937e538f22"/>
-      <w:r>
-        <w:t xml:space="preserve">RECOGNITIONS AND LANGUAGES</w:t>
-      </w:r>
-      <w:bookmarkEnd w:id="88"/>
+      <w:bookmarkStart w:id="89" w:name="_06db147aec534e4e119fe9c37d93c9ce1da6bca"/>
+      <w:r>
+        <w:t xml:space="preserve">Recognitions and Language</w:t>
+      </w:r>
+      <w:bookmarkEnd w:id="89"/>
     </w:p>
     <w:p>
       <w:pPr>
@@ -2600,7 +2635,7 @@
           <w:numId w:val="1010"/>
         </w:numPr>
       </w:pPr>
-      <w:hyperlink r:id="rId89">
+      <w:hyperlink r:id="rId90">
         <w:r>
           <w:rPr>
             <w:rStyle w:val="Hyperlink"/>
@@ -2623,7 +2658,7 @@
       <w:r>
         <w:t xml:space="preserve"> </w:t>
       </w:r>
-      <w:hyperlink r:id="rId90">
+      <w:hyperlink r:id="rId91">
         <w:r>
           <w:rPr>
             <w:rStyle w:val="Hyperlink"/>
@@ -2664,7 +2699,7 @@
       <w:r>
         <w:t xml:space="preserve"> </w:t>
       </w:r>
-      <w:hyperlink r:id="rId91">
+      <w:hyperlink r:id="rId92">
         <w:r>
           <w:rPr>
             <w:rStyle w:val="Hyperlink"/>
@@ -2839,11 +2874,11 @@
       <w:pPr>
         <w:pStyle w:val="Heading2"/>
       </w:pPr>
-      <w:bookmarkStart w:id="92" w:name="_831f2f1a4d8d04485c34fb194a5805b92e9efdb"/>
+      <w:bookmarkStart w:id="93" w:name="_831f2f1a4d8d04485c34fb194a5805b92e9efdb"/>
       <w:r>
         <w:t xml:space="preserve">My Academic Genealogy Tree</w:t>
       </w:r>
-      <w:bookmarkEnd w:id="92"/>
+      <w:bookmarkEnd w:id="93"/>
     </w:p>
     <w:p>
       <w:pPr>

</xml_diff>

<commit_message>
New site fixes - Thu Oct 29 17:38:30 UTC 2026
</commit_message>
<xml_diff>
--- a/web/index.docx
+++ b/web/index.docx
@@ -2,15 +2,14 @@
 <file path=word/document.xml><?xml version="1.0" encoding="utf-8"?>
 <w:document xmlns:w="http://schemas.openxmlformats.org/wordprocessingml/2006/main" xmlns:m="http://schemas.openxmlformats.org/officeDocument/2006/math" xmlns:r="http://schemas.openxmlformats.org/officeDocument/2006/relationships" xmlns:o="urn:schemas-microsoft-com:office:office" xmlns:v="urn:schemas-microsoft-com:vml" xmlns:w10="urn:schemas-microsoft-com:office:word" xmlns:a="http://schemas.openxmlformats.org/drawingml/2006/main" xmlns:pic="http://schemas.openxmlformats.org/drawingml/2006/picture" xmlns:wp="http://schemas.openxmlformats.org/drawingml/2006/wordprocessingDrawing">
   <w:body>
+    <w:bookmarkStart w:id="93" w:name="dr.-stefanos-georgiou"/>
     <w:p>
       <w:pPr>
         <w:pStyle w:val="Heading1"/>
       </w:pPr>
-      <w:bookmarkStart w:id="9" w:name="_882df295f43b1288baea710cd0add1c35221f37"/>
       <w:r>
         <w:t xml:space="preserve">Dr. Stefanos Georgiou</w:t>
       </w:r>
-      <w:bookmarkEnd w:id="9"/>
     </w:p>
     <w:p>
       <w:r>
@@ -81,21 +80,21 @@
       <w:r>
         <w:t xml:space="preserve"> </w:t>
       </w:r>
+      <w:hyperlink r:id="rId9">
+        <w:r>
+          <w:rPr>
+            <w:rStyle w:val="Hyperlink"/>
+          </w:rPr>
+          <w:t xml:space="preserve">coding</w:t>
+        </w:r>
+      </w:hyperlink>
+      <w:r>
+        <w:t xml:space="preserve">, exploring emerging technologies, and automating repetitive and time-consuming tasks. My research interests include Green and Energy-Efficient Computing, Mining Software Repositories, and Machine Learning. I enjoy working at the command line, particularly in Linux environments, and developing small, independent components and tools that simplify everyday tasks and improve productivity. I am always eager to learn, experiment with new technologies, and build practical solutions to real-world problems. In my free time, I enjoy sports, reading books, and</w:t>
+      </w:r>
+      <w:r>
+        <w:t xml:space="preserve"> </w:t>
+      </w:r>
       <w:hyperlink r:id="rId10">
-        <w:r>
-          <w:rPr>
-            <w:rStyle w:val="Hyperlink"/>
-          </w:rPr>
-          <w:t xml:space="preserve">coding</w:t>
-        </w:r>
-      </w:hyperlink>
-      <w:r>
-        <w:t xml:space="preserve">, exploring emerging technologies, and automating repetitive and time-consuming tasks. My research interests include Green and Energy-Efficient Computing, Mining Software Repositories, and Machine Learning. I enjoy working at the command line, particularly in Linux environments, and developing small, independent components and tools that simplify everyday tasks and improve productivity. I am always eager to learn, experiment with new technologies, and build practical solutions to real-world problems. In my free time, I enjoy sports, reading books, and</w:t>
-      </w:r>
-      <w:r>
-        <w:t xml:space="preserve"> </w:t>
-      </w:r>
-      <w:hyperlink r:id="rId11">
         <w:r>
           <w:rPr>
             <w:rStyle w:val="Hyperlink"/>
@@ -145,29 +144,29 @@
       <w:r>
         <w:t xml:space="preserve"> </w:t>
       </w:r>
+      <w:hyperlink r:id="rId11">
+        <w:r>
+          <w:rPr>
+            <w:rStyle w:val="Hyperlink"/>
+          </w:rPr>
+          <w:t xml:space="preserve">[PDF]</w:t>
+        </w:r>
+      </w:hyperlink>
+      <w:r>
+        <w:t xml:space="preserve"> </w:t>
+      </w:r>
       <w:hyperlink r:id="rId12">
         <w:r>
           <w:rPr>
             <w:rStyle w:val="Hyperlink"/>
           </w:rPr>
-          <w:t xml:space="preserve">[PDF]</w:t>
+          <w:t xml:space="preserve">[DOCX]</w:t>
         </w:r>
       </w:hyperlink>
       <w:r>
         <w:t xml:space="preserve"> </w:t>
       </w:r>
       <w:hyperlink r:id="rId13">
-        <w:r>
-          <w:rPr>
-            <w:rStyle w:val="Hyperlink"/>
-          </w:rPr>
-          <w:t xml:space="preserve">[DOCX]</w:t>
-        </w:r>
-      </w:hyperlink>
-      <w:r>
-        <w:t xml:space="preserve"> </w:t>
-      </w:r>
-      <w:hyperlink r:id="rId14">
         <w:r>
           <w:rPr>
             <w:rStyle w:val="Hyperlink"/>
@@ -183,15 +182,14 @@
         </w:pict>
       </w:r>
     </w:p>
+    <w:bookmarkStart w:id="24" w:name="education"/>
     <w:p>
       <w:pPr>
         <w:pStyle w:val="Heading2"/>
       </w:pPr>
-      <w:bookmarkStart w:id="15" w:name="_education"/>
       <w:r>
         <w:t xml:space="preserve">Education</w:t>
       </w:r>
-      <w:bookmarkEnd w:id="15"/>
     </w:p>
     <w:p>
       <w:pPr>
@@ -265,7 +263,7 @@
       <w:r>
         <w:t xml:space="preserve"> </w:t>
       </w:r>
-      <w:hyperlink r:id="rId16">
+      <w:hyperlink r:id="rId14">
         <w:r>
           <w:rPr>
             <w:rStyle w:val="Hyperlink"/>
@@ -320,54 +318,54 @@
       <w:r>
         <w:t xml:space="preserve"> </w:t>
       </w:r>
+      <w:hyperlink r:id="rId15">
+        <w:r>
+          <w:rPr>
+            <w:rStyle w:val="Hyperlink"/>
+          </w:rPr>
+          <w:t xml:space="preserve">Thesis</w:t>
+        </w:r>
+      </w:hyperlink>
+    </w:p>
+    <w:p>
+      <w:pPr>
+        <w:pStyle w:val="Definition"/>
+      </w:pPr>
+      <w:r>
+        <w:t xml:space="preserve">PhD advisors: (Main)</w:t>
+      </w:r>
+      <w:r>
+        <w:t xml:space="preserve"> </w:t>
+      </w:r>
+      <w:hyperlink r:id="rId16">
+        <w:r>
+          <w:rPr>
+            <w:rStyle w:val="Hyperlink"/>
+          </w:rPr>
+          <w:t xml:space="preserve">Prof. Diomidis Spinellis</w:t>
+        </w:r>
+      </w:hyperlink>
+      <w:r>
+        <w:t xml:space="preserve">,</w:t>
+      </w:r>
+      <w:r>
+        <w:t xml:space="preserve"> </w:t>
+      </w:r>
       <w:hyperlink r:id="rId17">
         <w:r>
           <w:rPr>
             <w:rStyle w:val="Hyperlink"/>
           </w:rPr>
-          <w:t xml:space="preserve">Thesis</w:t>
-        </w:r>
-      </w:hyperlink>
-    </w:p>
-    <w:p>
-      <w:pPr>
-        <w:pStyle w:val="Definition"/>
-      </w:pPr>
-      <w:r>
-        <w:t xml:space="preserve">PhD advisors: (Main)</w:t>
+          <w:t xml:space="preserve">Prof. Panos Louridas</w:t>
+        </w:r>
+      </w:hyperlink>
+      <w:r>
+        <w:t xml:space="preserve">, and</w:t>
       </w:r>
       <w:r>
         <w:t xml:space="preserve"> </w:t>
       </w:r>
       <w:hyperlink r:id="rId18">
-        <w:r>
-          <w:rPr>
-            <w:rStyle w:val="Hyperlink"/>
-          </w:rPr>
-          <w:t xml:space="preserve">Prof. Diomidis Spinellis</w:t>
-        </w:r>
-      </w:hyperlink>
-      <w:r>
-        <w:t xml:space="preserve">,</w:t>
-      </w:r>
-      <w:r>
-        <w:t xml:space="preserve"> </w:t>
-      </w:r>
-      <w:hyperlink r:id="rId19">
-        <w:r>
-          <w:rPr>
-            <w:rStyle w:val="Hyperlink"/>
-          </w:rPr>
-          <w:t xml:space="preserve">Prof. Panos Louridas</w:t>
-        </w:r>
-      </w:hyperlink>
-      <w:r>
-        <w:t xml:space="preserve">, and</w:t>
-      </w:r>
-      <w:r>
-        <w:t xml:space="preserve"> </w:t>
-      </w:r>
-      <w:hyperlink r:id="rId20">
         <w:r>
           <w:rPr>
             <w:rStyle w:val="Hyperlink"/>
@@ -422,7 +420,7 @@
       <w:r>
         <w:t xml:space="preserve"> </w:t>
       </w:r>
-      <w:hyperlink r:id="rId21">
+      <w:hyperlink r:id="rId19">
         <w:r>
           <w:rPr>
             <w:rStyle w:val="Hyperlink"/>
@@ -451,7 +449,7 @@
       <w:r>
         <w:t xml:space="preserve"> </w:t>
       </w:r>
-      <w:hyperlink r:id="rId22">
+      <w:hyperlink r:id="rId20">
         <w:r>
           <w:rPr>
             <w:rStyle w:val="Hyperlink"/>
@@ -480,7 +478,7 @@
       <w:r>
         <w:t xml:space="preserve"> </w:t>
       </w:r>
-      <w:hyperlink r:id="rId23">
+      <w:hyperlink r:id="rId21">
         <w:r>
           <w:rPr>
             <w:rStyle w:val="Hyperlink"/>
@@ -509,7 +507,7 @@
       <w:r>
         <w:t xml:space="preserve"> </w:t>
       </w:r>
-      <w:hyperlink r:id="rId24">
+      <w:hyperlink r:id="rId22">
         <w:r>
           <w:rPr>
             <w:rStyle w:val="Hyperlink"/>
@@ -543,7 +541,7 @@
       <w:r>
         <w:t xml:space="preserve"> </w:t>
       </w:r>
-      <w:hyperlink r:id="rId25">
+      <w:hyperlink r:id="rId23">
         <w:r>
           <w:rPr>
             <w:rStyle w:val="Hyperlink"/>
@@ -575,7 +573,7 @@
       <w:r>
         <w:t xml:space="preserve"> </w:t>
       </w:r>
-      <w:hyperlink r:id="rId25">
+      <w:hyperlink r:id="rId23">
         <w:r>
           <w:rPr>
             <w:rStyle w:val="Hyperlink"/>
@@ -584,15 +582,15 @@
         </w:r>
       </w:hyperlink>
     </w:p>
+    <w:bookmarkEnd w:id="24"/>
+    <w:bookmarkStart w:id="39" w:name="research-publications"/>
     <w:p>
       <w:pPr>
         <w:pStyle w:val="Heading2"/>
       </w:pPr>
-      <w:bookmarkStart w:id="26" w:name="_799e40edb6d63cc9c91a5b880a6b1cab320f023"/>
       <w:r>
         <w:t xml:space="preserve">Research Publications</w:t>
       </w:r>
-      <w:bookmarkEnd w:id="26"/>
     </w:p>
     <w:p>
       <w:pPr>
@@ -639,7 +637,7 @@
       <w:r>
         <w:t xml:space="preserve">[</w:t>
       </w:r>
-      <w:hyperlink r:id="rId27">
+      <w:hyperlink r:id="rId25">
         <w:r>
           <w:rPr>
             <w:rStyle w:val="Hyperlink"/>
@@ -678,29 +676,29 @@
       <w:r>
         <w:t xml:space="preserve">[</w:t>
       </w:r>
+      <w:hyperlink r:id="rId26">
+        <w:r>
+          <w:rPr>
+            <w:rStyle w:val="Hyperlink"/>
+          </w:rPr>
+          <w:t xml:space="preserve">Link</w:t>
+        </w:r>
+      </w:hyperlink>
+      <w:r>
+        <w:t xml:space="preserve">] [</w:t>
+      </w:r>
+      <w:hyperlink r:id="rId27">
+        <w:r>
+          <w:rPr>
+            <w:rStyle w:val="Hyperlink"/>
+          </w:rPr>
+          <w:t xml:space="preserve">Presentation</w:t>
+        </w:r>
+      </w:hyperlink>
+      <w:r>
+        <w:t xml:space="preserve">] [</w:t>
+      </w:r>
       <w:hyperlink r:id="rId28">
-        <w:r>
-          <w:rPr>
-            <w:rStyle w:val="Hyperlink"/>
-          </w:rPr>
-          <w:t xml:space="preserve">Link</w:t>
-        </w:r>
-      </w:hyperlink>
-      <w:r>
-        <w:t xml:space="preserve">] [</w:t>
-      </w:r>
-      <w:hyperlink r:id="rId29">
-        <w:r>
-          <w:rPr>
-            <w:rStyle w:val="Hyperlink"/>
-          </w:rPr>
-          <w:t xml:space="preserve">Presentation</w:t>
-        </w:r>
-      </w:hyperlink>
-      <w:r>
-        <w:t xml:space="preserve">] [</w:t>
-      </w:r>
-      <w:hyperlink r:id="rId30">
         <w:r>
           <w:rPr>
             <w:rStyle w:val="Hyperlink"/>
@@ -739,29 +737,29 @@
       <w:r>
         <w:t xml:space="preserve">[</w:t>
       </w:r>
+      <w:hyperlink r:id="rId29">
+        <w:r>
+          <w:rPr>
+            <w:rStyle w:val="Hyperlink"/>
+          </w:rPr>
+          <w:t xml:space="preserve">Link</w:t>
+        </w:r>
+      </w:hyperlink>
+      <w:r>
+        <w:t xml:space="preserve">] [</w:t>
+      </w:r>
+      <w:hyperlink r:id="rId30">
+        <w:r>
+          <w:rPr>
+            <w:rStyle w:val="Hyperlink"/>
+          </w:rPr>
+          <w:t xml:space="preserve">Presentation</w:t>
+        </w:r>
+      </w:hyperlink>
+      <w:r>
+        <w:t xml:space="preserve">] [</w:t>
+      </w:r>
       <w:hyperlink r:id="rId31">
-        <w:r>
-          <w:rPr>
-            <w:rStyle w:val="Hyperlink"/>
-          </w:rPr>
-          <w:t xml:space="preserve">Link</w:t>
-        </w:r>
-      </w:hyperlink>
-      <w:r>
-        <w:t xml:space="preserve">] [</w:t>
-      </w:r>
-      <w:hyperlink r:id="rId32">
-        <w:r>
-          <w:rPr>
-            <w:rStyle w:val="Hyperlink"/>
-          </w:rPr>
-          <w:t xml:space="preserve">Presentation</w:t>
-        </w:r>
-      </w:hyperlink>
-      <w:r>
-        <w:t xml:space="preserve">] [</w:t>
-      </w:r>
-      <w:hyperlink r:id="rId33">
         <w:r>
           <w:rPr>
             <w:rStyle w:val="Hyperlink"/>
@@ -800,7 +798,7 @@
       <w:r>
         <w:t xml:space="preserve">[</w:t>
       </w:r>
-      <w:hyperlink r:id="rId34">
+      <w:hyperlink r:id="rId32">
         <w:r>
           <w:rPr>
             <w:rStyle w:val="Hyperlink"/>
@@ -811,7 +809,7 @@
       <w:r>
         <w:t xml:space="preserve">] [</w:t>
       </w:r>
-      <w:hyperlink r:id="rId35">
+      <w:hyperlink r:id="rId33">
         <w:r>
           <w:rPr>
             <w:rStyle w:val="Hyperlink"/>
@@ -822,7 +820,7 @@
       <w:r>
         <w:t xml:space="preserve">] [</w:t>
       </w:r>
-      <w:hyperlink r:id="rId33">
+      <w:hyperlink r:id="rId31">
         <w:r>
           <w:rPr>
             <w:rStyle w:val="Hyperlink"/>
@@ -904,7 +902,7 @@
       <w:r>
         <w:t xml:space="preserve">[</w:t>
       </w:r>
-      <w:hyperlink r:id="rId36">
+      <w:hyperlink r:id="rId34">
         <w:r>
           <w:rPr>
             <w:rStyle w:val="Hyperlink"/>
@@ -949,7 +947,7 @@
       <w:r>
         <w:t xml:space="preserve">[</w:t>
       </w:r>
-      <w:hyperlink r:id="rId37">
+      <w:hyperlink r:id="rId35">
         <w:r>
           <w:rPr>
             <w:rStyle w:val="Hyperlink"/>
@@ -994,7 +992,7 @@
       <w:r>
         <w:t xml:space="preserve">[</w:t>
       </w:r>
-      <w:hyperlink r:id="rId38">
+      <w:hyperlink r:id="rId36">
         <w:r>
           <w:rPr>
             <w:rStyle w:val="Hyperlink"/>
@@ -1058,7 +1056,7 @@
       <w:r>
         <w:t xml:space="preserve">[</w:t>
       </w:r>
-      <w:hyperlink r:id="rId39">
+      <w:hyperlink r:id="rId37">
         <w:r>
           <w:rPr>
             <w:rStyle w:val="Hyperlink"/>
@@ -1097,7 +1095,7 @@
       <w:r>
         <w:t xml:space="preserve">[</w:t>
       </w:r>
-      <w:hyperlink r:id="rId40">
+      <w:hyperlink r:id="rId38">
         <w:r>
           <w:rPr>
             <w:rStyle w:val="Hyperlink"/>
@@ -1109,15 +1107,15 @@
         <w:t xml:space="preserve">]</w:t>
       </w:r>
     </w:p>
+    <w:bookmarkEnd w:id="39"/>
+    <w:bookmarkStart w:id="40" w:name="organization-services"/>
     <w:p>
       <w:pPr>
         <w:pStyle w:val="Heading2"/>
       </w:pPr>
-      <w:bookmarkStart w:id="41" w:name="_e5bd27a4a70528ddbc4c12eea3c9eca69cfa426"/>
       <w:r>
         <w:t xml:space="preserve">Organization Services</w:t>
       </w:r>
-      <w:bookmarkEnd w:id="41"/>
     </w:p>
     <w:p>
       <w:pPr>
@@ -1219,15 +1217,15 @@
         <w:t xml:space="preserve">Conference papers submitted to ICSE-SEIP, MSR, OSS, ICPC, ICCS, SANER, FSE, ASE, ICMSE and SATToSE</w:t>
       </w:r>
     </w:p>
+    <w:bookmarkEnd w:id="40"/>
+    <w:bookmarkStart w:id="46" w:name="invited-talks"/>
     <w:p>
       <w:pPr>
         <w:pStyle w:val="Heading2"/>
       </w:pPr>
-      <w:bookmarkStart w:id="42" w:name="_d92adb52484a714afc99a8491ccb75f3bf3313e"/>
       <w:r>
         <w:t xml:space="preserve">Invited Talks</w:t>
       </w:r>
-      <w:bookmarkEnd w:id="42"/>
     </w:p>
     <w:p>
       <w:pPr>
@@ -1257,7 +1255,7 @@
       <w:r>
         <w:t xml:space="preserve"> </w:t>
       </w:r>
-      <w:hyperlink r:id="rId43">
+      <w:hyperlink r:id="rId41">
         <w:r>
           <w:rPr>
             <w:rStyle w:val="Hyperlink"/>
@@ -1286,7 +1284,7 @@
       <w:r>
         <w:t xml:space="preserve"> </w:t>
       </w:r>
-      <w:hyperlink r:id="rId44">
+      <w:hyperlink r:id="rId42">
         <w:r>
           <w:rPr>
             <w:rStyle w:val="Hyperlink"/>
@@ -1323,7 +1321,7 @@
       <w:r>
         <w:t xml:space="preserve"> </w:t>
       </w:r>
-      <w:hyperlink r:id="rId45">
+      <w:hyperlink r:id="rId43">
         <w:r>
           <w:rPr>
             <w:rStyle w:val="Hyperlink"/>
@@ -1334,7 +1332,7 @@
       <w:r>
         <w:t xml:space="preserve"> </w:t>
       </w:r>
-      <w:hyperlink r:id="rId46">
+      <w:hyperlink r:id="rId44">
         <w:r>
           <w:rPr>
             <w:rStyle w:val="Hyperlink"/>
@@ -1363,100 +1361,100 @@
       <w:r>
         <w:t xml:space="preserve"> </w:t>
       </w:r>
+      <w:hyperlink r:id="rId45">
+        <w:r>
+          <w:rPr>
+            <w:rStyle w:val="Hyperlink"/>
+          </w:rPr>
+          <w:t xml:space="preserve">Proof</w:t>
+        </w:r>
+      </w:hyperlink>
+    </w:p>
+    <w:bookmarkEnd w:id="46"/>
+    <w:bookmarkStart w:id="50" w:name="teaching-experience"/>
+    <w:p>
+      <w:pPr>
+        <w:pStyle w:val="Heading2"/>
+      </w:pPr>
+      <w:r>
+        <w:t xml:space="preserve">Teaching Experience</w:t>
+      </w:r>
+    </w:p>
+    <w:p>
+      <w:pPr>
+        <w:pStyle w:val="FirstParagraph"/>
+      </w:pPr>
+      <w:r>
+        <w:t xml:space="preserve">Having weekly meetings with five PhD students and two Master students to assist and advise them on their research studies (at Queen’s University from 2021 to 2023)</w:t>
+      </w:r>
+    </w:p>
+    <w:p>
+      <w:pPr>
+        <w:pStyle w:val="BodyText"/>
+      </w:pPr>
+      <w:r>
+        <w:t xml:space="preserve">Assisting my PhD advisor at Programming II course (Winter Semester of 2016, 2017, and 2018) by giving tutorial and Lab sessions in Java [</w:t>
+      </w:r>
       <w:hyperlink r:id="rId47">
         <w:r>
           <w:rPr>
             <w:rStyle w:val="Hyperlink"/>
           </w:rPr>
+          <w:t xml:space="preserve">Repository</w:t>
+        </w:r>
+      </w:hyperlink>
+      <w:r>
+        <w:t xml:space="preserve">]</w:t>
+      </w:r>
+    </w:p>
+    <w:p>
+      <w:pPr>
+        <w:pStyle w:val="BodyText"/>
+      </w:pPr>
+      <w:r>
+        <w:t xml:space="preserve">Gave Java lectures and tutorials for the 1st and 2nd Coding Boot Camp in Athens, Greece (Oct. 2017 - May 2018)</w:t>
+      </w:r>
+      <w:r>
+        <w:t xml:space="preserve"> </w:t>
+      </w:r>
+      <w:r>
+        <w:t xml:space="preserve"> </w:t>
+      </w:r>
+      <w:r>
+        <w:t xml:space="preserve">[</w:t>
+      </w:r>
+      <w:hyperlink r:id="rId48">
+        <w:r>
+          <w:rPr>
+            <w:rStyle w:val="Hyperlink"/>
+          </w:rPr>
+          <w:t xml:space="preserve">Repository</w:t>
+        </w:r>
+      </w:hyperlink>
+      <w:r>
+        <w:t xml:space="preserve">] [</w:t>
+      </w:r>
+      <w:hyperlink r:id="rId49">
+        <w:r>
+          <w:rPr>
+            <w:rStyle w:val="Hyperlink"/>
+          </w:rPr>
           <w:t xml:space="preserve">Proof</w:t>
         </w:r>
       </w:hyperlink>
-    </w:p>
+      <w:r>
+        <w:t xml:space="preserve">]</w:t>
+      </w:r>
+    </w:p>
+    <w:bookmarkEnd w:id="50"/>
+    <w:bookmarkStart w:id="81" w:name="developer-working-experience"/>
     <w:p>
       <w:pPr>
         <w:pStyle w:val="Heading2"/>
       </w:pPr>
-      <w:bookmarkStart w:id="48" w:name="_6a59066c3a6e5df6600690f250943ddabffdd1a"/>
-      <w:r>
-        <w:t xml:space="preserve">Teaching Experience</w:t>
-      </w:r>
-      <w:bookmarkEnd w:id="48"/>
-    </w:p>
-    <w:p>
-      <w:pPr>
-        <w:pStyle w:val="FirstParagraph"/>
-      </w:pPr>
-      <w:r>
-        <w:t xml:space="preserve">Having weekly meetings with five PhD students and two Master students to assist and advise them on their research studies (at Queen’s University from 2021 to 2023)</w:t>
-      </w:r>
-    </w:p>
-    <w:p>
-      <w:pPr>
-        <w:pStyle w:val="BodyText"/>
-      </w:pPr>
-      <w:r>
-        <w:t xml:space="preserve">Assisting my PhD advisor at Programming II course (Winter Semester of 2016, 2017, and 2018) by giving tutorial and Lab sessions in Java [</w:t>
-      </w:r>
-      <w:hyperlink r:id="rId49">
-        <w:r>
-          <w:rPr>
-            <w:rStyle w:val="Hyperlink"/>
-          </w:rPr>
-          <w:t xml:space="preserve">Repository</w:t>
-        </w:r>
-      </w:hyperlink>
-      <w:r>
-        <w:t xml:space="preserve">]</w:t>
-      </w:r>
-    </w:p>
-    <w:p>
-      <w:pPr>
-        <w:pStyle w:val="BodyText"/>
-      </w:pPr>
-      <w:r>
-        <w:t xml:space="preserve">Gave Java lectures and tutorials for the 1st and 2nd Coding Boot Camp in Athens, Greece (Oct. 2017 - May 2018)</w:t>
-      </w:r>
-      <w:r>
-        <w:t xml:space="preserve"> </w:t>
-      </w:r>
-      <w:r>
-        <w:t xml:space="preserve"> </w:t>
-      </w:r>
-      <w:r>
-        <w:t xml:space="preserve">[</w:t>
-      </w:r>
-      <w:hyperlink r:id="rId50">
-        <w:r>
-          <w:rPr>
-            <w:rStyle w:val="Hyperlink"/>
-          </w:rPr>
-          <w:t xml:space="preserve">Repository</w:t>
-        </w:r>
-      </w:hyperlink>
-      <w:r>
-        <w:t xml:space="preserve">] [</w:t>
-      </w:r>
-      <w:hyperlink r:id="rId51">
-        <w:r>
-          <w:rPr>
-            <w:rStyle w:val="Hyperlink"/>
-          </w:rPr>
-          <w:t xml:space="preserve">Proof</w:t>
-        </w:r>
-      </w:hyperlink>
-      <w:r>
-        <w:t xml:space="preserve">]</w:t>
-      </w:r>
-    </w:p>
-    <w:p>
-      <w:pPr>
-        <w:pStyle w:val="Heading2"/>
-      </w:pPr>
-      <w:bookmarkStart w:id="52" w:name="_06c59885f23e3f8e077b05402aa304ce183fabc"/>
       <w:r>
         <w:t xml:space="preserve">Developer Working Experience</w:t>
       </w:r>
-      <w:bookmarkEnd w:id="52"/>
     </w:p>
     <w:p>
       <w:pPr>
@@ -1486,7 +1484,7 @@
       <w:r>
         <w:t xml:space="preserve"> </w:t>
       </w:r>
-      <w:hyperlink r:id="rId53">
+      <w:hyperlink r:id="rId51">
         <w:r>
           <w:rPr>
             <w:rStyle w:val="Hyperlink"/>
@@ -1515,7 +1513,7 @@
       <w:r>
         <w:t xml:space="preserve"> </w:t>
       </w:r>
-      <w:hyperlink r:id="rId54">
+      <w:hyperlink r:id="rId52">
         <w:r>
           <w:rPr>
             <w:rStyle w:val="Hyperlink"/>
@@ -1544,7 +1542,7 @@
       <w:r>
         <w:t xml:space="preserve"> </w:t>
       </w:r>
-      <w:hyperlink r:id="rId55">
+      <w:hyperlink r:id="rId53">
         <w:r>
           <w:rPr>
             <w:rStyle w:val="Hyperlink"/>
@@ -1573,7 +1571,7 @@
       <w:r>
         <w:t xml:space="preserve"> </w:t>
       </w:r>
-      <w:hyperlink r:id="rId56">
+      <w:hyperlink r:id="rId54">
         <w:r>
           <w:rPr>
             <w:rStyle w:val="Hyperlink"/>
@@ -1610,7 +1608,7 @@
       <w:r>
         <w:t xml:space="preserve"> </w:t>
       </w:r>
-      <w:hyperlink r:id="rId57">
+      <w:hyperlink r:id="rId55">
         <w:r>
           <w:rPr>
             <w:rStyle w:val="Hyperlink"/>
@@ -1647,7 +1645,7 @@
       <w:r>
         <w:t xml:space="preserve"> </w:t>
       </w:r>
-      <w:hyperlink r:id="rId58">
+      <w:hyperlink r:id="rId56">
         <w:r>
           <w:rPr>
             <w:rStyle w:val="Hyperlink"/>
@@ -1688,7 +1686,7 @@
       <w:r>
         <w:t xml:space="preserve"> </w:t>
       </w:r>
-      <w:hyperlink r:id="rId59">
+      <w:hyperlink r:id="rId57">
         <w:r>
           <w:rPr>
             <w:rStyle w:val="Hyperlink"/>
@@ -1705,7 +1703,7 @@
       <w:r>
         <w:t xml:space="preserve"> </w:t>
       </w:r>
-      <w:hyperlink r:id="rId60">
+      <w:hyperlink r:id="rId58">
         <w:r>
           <w:rPr>
             <w:rStyle w:val="Hyperlink"/>
@@ -1746,7 +1744,7 @@
       <w:r>
         <w:t xml:space="preserve"> </w:t>
       </w:r>
-      <w:hyperlink r:id="rId61">
+      <w:hyperlink r:id="rId59">
         <w:r>
           <w:rPr>
             <w:rStyle w:val="Hyperlink"/>
@@ -1787,7 +1785,7 @@
       <w:r>
         <w:t xml:space="preserve"> </w:t>
       </w:r>
-      <w:hyperlink r:id="rId62">
+      <w:hyperlink r:id="rId60">
         <w:r>
           <w:rPr>
             <w:rStyle w:val="Hyperlink"/>
@@ -1898,7 +1896,7 @@
       <w:r>
         <w:t xml:space="preserve"> </w:t>
       </w:r>
-      <w:hyperlink r:id="rId63">
+      <w:hyperlink r:id="rId61">
         <w:r>
           <w:rPr>
             <w:rStyle w:val="Hyperlink"/>
@@ -1927,7 +1925,7 @@
       <w:r>
         <w:t xml:space="preserve"> </w:t>
       </w:r>
-      <w:hyperlink r:id="rId64">
+      <w:hyperlink r:id="rId62">
         <w:r>
           <w:rPr>
             <w:rStyle w:val="Hyperlink"/>
@@ -1938,7 +1936,7 @@
       <w:r>
         <w:t xml:space="preserve"> </w:t>
       </w:r>
-      <w:hyperlink r:id="rId65">
+      <w:hyperlink r:id="rId63">
         <w:r>
           <w:rPr>
             <w:rStyle w:val="Hyperlink"/>
@@ -1961,35 +1959,35 @@
       <w:r>
         <w:t xml:space="preserve"> </w:t>
       </w:r>
+      <w:hyperlink r:id="rId64">
+        <w:r>
+          <w:rPr>
+            <w:rStyle w:val="Hyperlink"/>
+          </w:rPr>
+          <w:t xml:space="preserve">Python</w:t>
+        </w:r>
+      </w:hyperlink>
+      <w:r>
+        <w:t xml:space="preserve">,</w:t>
+      </w:r>
+      <w:r>
+        <w:t xml:space="preserve"> </w:t>
+      </w:r>
+      <w:hyperlink r:id="rId65">
+        <w:r>
+          <w:rPr>
+            <w:rStyle w:val="Hyperlink"/>
+          </w:rPr>
+          <w:t xml:space="preserve">Shell</w:t>
+        </w:r>
+      </w:hyperlink>
+      <w:r>
+        <w:t xml:space="preserve">, and</w:t>
+      </w:r>
+      <w:r>
+        <w:t xml:space="preserve"> </w:t>
+      </w:r>
       <w:hyperlink r:id="rId66">
-        <w:r>
-          <w:rPr>
-            <w:rStyle w:val="Hyperlink"/>
-          </w:rPr>
-          <w:t xml:space="preserve">Python</w:t>
-        </w:r>
-      </w:hyperlink>
-      <w:r>
-        <w:t xml:space="preserve">,</w:t>
-      </w:r>
-      <w:r>
-        <w:t xml:space="preserve"> </w:t>
-      </w:r>
-      <w:hyperlink r:id="rId67">
-        <w:r>
-          <w:rPr>
-            <w:rStyle w:val="Hyperlink"/>
-          </w:rPr>
-          <w:t xml:space="preserve">Shell</w:t>
-        </w:r>
-      </w:hyperlink>
-      <w:r>
-        <w:t xml:space="preserve">, and</w:t>
-      </w:r>
-      <w:r>
-        <w:t xml:space="preserve"> </w:t>
-      </w:r>
-      <w:hyperlink r:id="rId68">
         <w:r>
           <w:rPr>
             <w:rStyle w:val="Hyperlink"/>
@@ -2032,7 +2030,7 @@
       <w:r>
         <w:t xml:space="preserve"> </w:t>
       </w:r>
-      <w:hyperlink r:id="rId69">
+      <w:hyperlink r:id="rId67">
         <w:r>
           <w:rPr>
             <w:rStyle w:val="Hyperlink"/>
@@ -2051,7 +2049,7 @@
       <w:r>
         <w:t xml:space="preserve"> </w:t>
       </w:r>
-      <w:hyperlink r:id="rId70">
+      <w:hyperlink r:id="rId68">
         <w:r>
           <w:rPr>
             <w:rStyle w:val="Hyperlink"/>
@@ -2087,7 +2085,7 @@
       <w:r>
         <w:t xml:space="preserve"> </w:t>
       </w:r>
-      <w:hyperlink r:id="rId58">
+      <w:hyperlink r:id="rId56">
         <w:r>
           <w:rPr>
             <w:rStyle w:val="Hyperlink"/>
@@ -2104,7 +2102,7 @@
       <w:r>
         <w:t xml:space="preserve"> </w:t>
       </w:r>
-      <w:hyperlink r:id="rId71">
+      <w:hyperlink r:id="rId69">
         <w:r>
           <w:rPr>
             <w:rStyle w:val="Hyperlink"/>
@@ -2133,55 +2131,55 @@
       <w:r>
         <w:t xml:space="preserve"> </w:t>
       </w:r>
+      <w:hyperlink r:id="rId70">
+        <w:r>
+          <w:rPr>
+            <w:rStyle w:val="Hyperlink"/>
+          </w:rPr>
+          <w:t xml:space="preserve">Mocha</w:t>
+        </w:r>
+      </w:hyperlink>
+      <w:r>
+        <w:t xml:space="preserve">,</w:t>
+      </w:r>
+      <w:r>
+        <w:t xml:space="preserve"> </w:t>
+      </w:r>
+      <w:hyperlink r:id="rId71">
+        <w:r>
+          <w:rPr>
+            <w:rStyle w:val="Hyperlink"/>
+          </w:rPr>
+          <w:t xml:space="preserve">Chai</w:t>
+        </w:r>
+      </w:hyperlink>
+      <w:r>
+        <w:t xml:space="preserve"> </w:t>
+      </w:r>
+      <w:r>
+        <w:t xml:space="preserve">and</w:t>
+      </w:r>
+      <w:r>
+        <w:t xml:space="preserve"> </w:t>
+      </w:r>
       <w:hyperlink r:id="rId72">
         <w:r>
           <w:rPr>
             <w:rStyle w:val="Hyperlink"/>
           </w:rPr>
-          <w:t xml:space="preserve">Mocha</w:t>
-        </w:r>
-      </w:hyperlink>
-      <w:r>
-        <w:t xml:space="preserve">,</w:t>
+          <w:t xml:space="preserve">Cypress</w:t>
+        </w:r>
+      </w:hyperlink>
+      <w:r>
+        <w:t xml:space="preserve"> </w:t>
+      </w:r>
+      <w:r>
+        <w:t xml:space="preserve">frameworks, respectively) and auto-deploy product on Google’s App Engine (Aurora, Beta, and Production) using the</w:t>
       </w:r>
       <w:r>
         <w:t xml:space="preserve"> </w:t>
       </w:r>
       <w:hyperlink r:id="rId73">
-        <w:r>
-          <w:rPr>
-            <w:rStyle w:val="Hyperlink"/>
-          </w:rPr>
-          <w:t xml:space="preserve">Chai</w:t>
-        </w:r>
-      </w:hyperlink>
-      <w:r>
-        <w:t xml:space="preserve"> </w:t>
-      </w:r>
-      <w:r>
-        <w:t xml:space="preserve">and</w:t>
-      </w:r>
-      <w:r>
-        <w:t xml:space="preserve"> </w:t>
-      </w:r>
-      <w:hyperlink r:id="rId74">
-        <w:r>
-          <w:rPr>
-            <w:rStyle w:val="Hyperlink"/>
-          </w:rPr>
-          <w:t xml:space="preserve">Cypress</w:t>
-        </w:r>
-      </w:hyperlink>
-      <w:r>
-        <w:t xml:space="preserve"> </w:t>
-      </w:r>
-      <w:r>
-        <w:t xml:space="preserve">frameworks, respectively) and auto-deploy product on Google’s App Engine (Aurora, Beta, and Production) using the</w:t>
-      </w:r>
-      <w:r>
-        <w:t xml:space="preserve"> </w:t>
-      </w:r>
-      <w:hyperlink r:id="rId75">
         <w:r>
           <w:rPr>
             <w:rStyle w:val="Hyperlink"/>
@@ -2207,35 +2205,35 @@
       <w:r>
         <w:t xml:space="preserve"> </w:t>
       </w:r>
+      <w:hyperlink r:id="rId74">
+        <w:r>
+          <w:rPr>
+            <w:rStyle w:val="Hyperlink"/>
+          </w:rPr>
+          <w:t xml:space="preserve">Firebase hosting</w:t>
+        </w:r>
+      </w:hyperlink>
+      <w:r>
+        <w:t xml:space="preserve">,</w:t>
+      </w:r>
+      <w:r>
+        <w:t xml:space="preserve"> </w:t>
+      </w:r>
+      <w:hyperlink r:id="rId75">
+        <w:r>
+          <w:rPr>
+            <w:rStyle w:val="Hyperlink"/>
+          </w:rPr>
+          <w:t xml:space="preserve">Cloud Functions</w:t>
+        </w:r>
+      </w:hyperlink>
+      <w:r>
+        <w:t xml:space="preserve">, and</w:t>
+      </w:r>
+      <w:r>
+        <w:t xml:space="preserve"> </w:t>
+      </w:r>
       <w:hyperlink r:id="rId76">
-        <w:r>
-          <w:rPr>
-            <w:rStyle w:val="Hyperlink"/>
-          </w:rPr>
-          <w:t xml:space="preserve">Firebase hosting</w:t>
-        </w:r>
-      </w:hyperlink>
-      <w:r>
-        <w:t xml:space="preserve">,</w:t>
-      </w:r>
-      <w:r>
-        <w:t xml:space="preserve"> </w:t>
-      </w:r>
-      <w:hyperlink r:id="rId77">
-        <w:r>
-          <w:rPr>
-            <w:rStyle w:val="Hyperlink"/>
-          </w:rPr>
-          <w:t xml:space="preserve">Cloud Functions</w:t>
-        </w:r>
-      </w:hyperlink>
-      <w:r>
-        <w:t xml:space="preserve">, and</w:t>
-      </w:r>
-      <w:r>
-        <w:t xml:space="preserve"> </w:t>
-      </w:r>
-      <w:hyperlink r:id="rId78">
         <w:r>
           <w:rPr>
             <w:rStyle w:val="Hyperlink"/>
@@ -2261,7 +2259,7 @@
       <w:r>
         <w:t xml:space="preserve"> </w:t>
       </w:r>
-      <w:hyperlink r:id="rId79">
+      <w:hyperlink r:id="rId77">
         <w:r>
           <w:rPr>
             <w:rStyle w:val="Hyperlink"/>
@@ -2278,7 +2276,7 @@
       <w:r>
         <w:t xml:space="preserve"> </w:t>
       </w:r>
-      <w:hyperlink r:id="rId80">
+      <w:hyperlink r:id="rId78">
         <w:r>
           <w:rPr>
             <w:rStyle w:val="Hyperlink"/>
@@ -2315,7 +2313,7 @@
       <w:r>
         <w:t xml:space="preserve"> </w:t>
       </w:r>
-      <w:hyperlink r:id="rId81">
+      <w:hyperlink r:id="rId79">
         <w:r>
           <w:rPr>
             <w:rStyle w:val="Hyperlink"/>
@@ -2347,7 +2345,7 @@
       <w:r>
         <w:t xml:space="preserve"> </w:t>
       </w:r>
-      <w:hyperlink r:id="rId82">
+      <w:hyperlink r:id="rId80">
         <w:r>
           <w:rPr>
             <w:rStyle w:val="Hyperlink"/>
@@ -2356,15 +2354,15 @@
         </w:r>
       </w:hyperlink>
     </w:p>
+    <w:bookmarkEnd w:id="81"/>
+    <w:bookmarkStart w:id="87" w:name="tech-skillset"/>
     <w:p>
       <w:pPr>
         <w:pStyle w:val="Heading2"/>
       </w:pPr>
-      <w:bookmarkStart w:id="83" w:name="_b3cbc0e99ad15217bce1933e8c79845e37f6c1f"/>
       <w:r>
         <w:t xml:space="preserve">TECH SKILLSET</w:t>
       </w:r>
-      <w:bookmarkEnd w:id="83"/>
     </w:p>
     <w:p>
       <w:pPr>
@@ -2516,24 +2514,49 @@
       <w:r>
         <w:t xml:space="preserve"> </w:t>
       </w:r>
+      <w:hyperlink r:id="rId82">
+        <w:r>
+          <w:rPr>
+            <w:rStyle w:val="Hyperlink"/>
+          </w:rPr>
+          <w:t xml:space="preserve">Data, Software, and Production Engineering</w:t>
+        </w:r>
+      </w:hyperlink>
+    </w:p>
+    <w:p>
+      <w:pPr>
+        <w:pStyle w:val="Definition"/>
+      </w:pPr>
+      <w:r>
+        <w:t xml:space="preserve">MongoDB:</w:t>
+      </w:r>
+      <w:r>
+        <w:t xml:space="preserve"> </w:t>
+      </w:r>
+      <w:hyperlink r:id="rId83">
+        <w:r>
+          <w:rPr>
+            <w:rStyle w:val="Hyperlink"/>
+          </w:rPr>
+          <w:t xml:space="preserve">Basics</w:t>
+        </w:r>
+      </w:hyperlink>
+      <w:r>
+        <w:t xml:space="preserve">,</w:t>
+      </w:r>
+      <w:r>
+        <w:t xml:space="preserve"> </w:t>
+      </w:r>
       <w:hyperlink r:id="rId84">
         <w:r>
           <w:rPr>
             <w:rStyle w:val="Hyperlink"/>
           </w:rPr>
-          <w:t xml:space="preserve">Data, Software, and Production Engineering</w:t>
-        </w:r>
-      </w:hyperlink>
-      <w:r>
-        <w:br/>
-      </w:r>
-    </w:p>
-    <w:p>
-      <w:pPr>
-        <w:pStyle w:val="Definition"/>
-      </w:pPr>
-      <w:r>
-        <w:t xml:space="preserve">MongoDB:</w:t>
+          <w:t xml:space="preserve">Aggregation</w:t>
+        </w:r>
+      </w:hyperlink>
+      <w:r>
+        <w:t xml:space="preserve">,</w:t>
       </w:r>
       <w:r>
         <w:t xml:space="preserve"> </w:t>
@@ -2543,11 +2566,11 @@
           <w:rPr>
             <w:rStyle w:val="Hyperlink"/>
           </w:rPr>
-          <w:t xml:space="preserve">Basics</w:t>
-        </w:r>
-      </w:hyperlink>
-      <w:r>
-        <w:t xml:space="preserve">,</w:t>
+          <w:t xml:space="preserve">JavaScript</w:t>
+        </w:r>
+      </w:hyperlink>
+      <w:r>
+        <w:t xml:space="preserve">, and</w:t>
       </w:r>
       <w:r>
         <w:t xml:space="preserve"> </w:t>
@@ -2557,34 +2580,6 @@
           <w:rPr>
             <w:rStyle w:val="Hyperlink"/>
           </w:rPr>
-          <w:t xml:space="preserve">Aggregation</w:t>
-        </w:r>
-      </w:hyperlink>
-      <w:r>
-        <w:t xml:space="preserve">,</w:t>
-      </w:r>
-      <w:r>
-        <w:t xml:space="preserve"> </w:t>
-      </w:r>
-      <w:hyperlink r:id="rId87">
-        <w:r>
-          <w:rPr>
-            <w:rStyle w:val="Hyperlink"/>
-          </w:rPr>
-          <w:t xml:space="preserve">JavaScript</w:t>
-        </w:r>
-      </w:hyperlink>
-      <w:r>
-        <w:t xml:space="preserve">, and</w:t>
-      </w:r>
-      <w:r>
-        <w:t xml:space="preserve"> </w:t>
-      </w:r>
-      <w:hyperlink r:id="rId88">
-        <w:r>
-          <w:rPr>
-            <w:rStyle w:val="Hyperlink"/>
-          </w:rPr>
           <w:t xml:space="preserve">Performance</w:t>
         </w:r>
       </w:hyperlink>
@@ -2605,15 +2600,15 @@
         <w:t xml:space="preserve">Loading the data just for you.</w:t>
       </w:r>
     </w:p>
+    <w:bookmarkEnd w:id="87"/>
+    <w:bookmarkStart w:id="91" w:name="recognitions-and-language"/>
     <w:p>
       <w:pPr>
         <w:pStyle w:val="Heading2"/>
       </w:pPr>
-      <w:bookmarkStart w:id="89" w:name="_06db147aec534e4e119fe9c37d93c9ce1da6bca"/>
       <w:r>
         <w:t xml:space="preserve">Recognitions and Language</w:t>
       </w:r>
-      <w:bookmarkEnd w:id="89"/>
     </w:p>
     <w:p>
       <w:pPr>
@@ -2635,7 +2630,7 @@
           <w:numId w:val="1010"/>
         </w:numPr>
       </w:pPr>
-      <w:hyperlink r:id="rId90">
+      <w:hyperlink r:id="rId88">
         <w:r>
           <w:rPr>
             <w:rStyle w:val="Hyperlink"/>
@@ -2658,7 +2653,7 @@
       <w:r>
         <w:t xml:space="preserve"> </w:t>
       </w:r>
-      <w:hyperlink r:id="rId91">
+      <w:hyperlink r:id="rId89">
         <w:r>
           <w:rPr>
             <w:rStyle w:val="Hyperlink"/>
@@ -2699,7 +2694,7 @@
       <w:r>
         <w:t xml:space="preserve"> </w:t>
       </w:r>
-      <w:hyperlink r:id="rId92">
+      <w:hyperlink r:id="rId90">
         <w:r>
           <w:rPr>
             <w:rStyle w:val="Hyperlink"/>
@@ -2870,15 +2865,15 @@
         <w:t xml:space="preserve">Biked in Delft, the Netherlands for my PhD secondment (Half month of Sept. 2017)</w:t>
       </w:r>
     </w:p>
+    <w:bookmarkEnd w:id="91"/>
+    <w:bookmarkStart w:id="92" w:name="my-academic-genealogy-tree"/>
     <w:p>
       <w:pPr>
         <w:pStyle w:val="Heading2"/>
       </w:pPr>
-      <w:bookmarkStart w:id="93" w:name="_831f2f1a4d8d04485c34fb194a5805b92e9efdb"/>
       <w:r>
         <w:t xml:space="preserve">My Academic Genealogy Tree</w:t>
       </w:r>
-      <w:bookmarkEnd w:id="93"/>
     </w:p>
     <w:p>
       <w:pPr>
@@ -2900,6 +2895,8 @@
         </w:pict>
       </w:r>
     </w:p>
+    <w:bookmarkEnd w:id="92"/>
+    <w:bookmarkEnd w:id="93"/>
     <w:sectPr>
       <w:footnotePr>
         <w:numRestart w:val="eachSect"/>
@@ -3160,10 +3157,10 @@
   <w:docDefaults>
     <w:rPrDefault>
       <w:rPr>
-        <w:rFonts w:asciiTheme="minorHAnsi" w:eastAsiaTheme="minorEastAsia" w:hAnsiTheme="minorHAnsi" w:cstheme="minorBidi"/>
+        <w:rFonts w:asciiTheme="minorHAnsi" w:cstheme="minorBidi" w:eastAsiaTheme="minorHAnsi" w:hAnsiTheme="minorHAnsi"/>
         <w:sz w:val="24"/>
         <w:szCs w:val="24"/>
-        <w:lang w:val="en-US" w:eastAsia="zh-CN" w:bidi="ar-SA"/>
+        <w:lang w:bidi="ar-SA" w:eastAsia="en-US" w:val="en-US"/>
       </w:rPr>
     </w:rPrDefault>
     <w:pPrDefault>
@@ -3172,35 +3169,35 @@
       </w:pPr>
     </w:pPrDefault>
   </w:docDefaults>
-  <w:latentStyles w:defLockedState="0" w:defUIPriority="0" w:defSemiHidden="0" w:defUnhideWhenUsed="0" w:defQFormat="0" w:count="276"/>
-  <w:style w:type="paragraph" w:default="1" w:styleId="Normal">
+  <w:latentStyles w:count="276" w:defLockedState="0" w:defQFormat="0" w:defSemiHidden="0" w:defUIPriority="0" w:defUnhideWhenUsed="0"/>
+  <w:style w:default="1" w:styleId="Normal" w:type="paragraph">
     <w:name w:val="Normal"/>
     <w:qFormat/>
   </w:style>
-  <w:style w:type="paragraph" w:styleId="BodyText">
+  <w:style w:styleId="BodyText" w:type="paragraph">
     <w:name w:val="Body Text"/>
     <w:basedOn w:val="Normal"/>
     <w:link w:val="BodyTextChar"/>
     <w:qFormat/>
     <w:pPr>
-      <w:spacing w:before="180" w:after="180"/>
+      <w:spacing w:after="180" w:before="180"/>
     </w:pPr>
   </w:style>
-  <w:style w:type="paragraph" w:customStyle="1" w:styleId="FirstParagraph">
+  <w:style w:customStyle="1" w:styleId="FirstParagraph" w:type="paragraph">
     <w:name w:val="First Paragraph"/>
     <w:basedOn w:val="BodyText"/>
     <w:next w:val="BodyText"/>
     <w:qFormat/>
   </w:style>
-  <w:style w:type="paragraph" w:customStyle="1" w:styleId="Compact">
+  <w:style w:customStyle="1" w:styleId="Compact" w:type="paragraph">
     <w:name w:val="Compact"/>
     <w:basedOn w:val="BodyText"/>
     <w:qFormat/>
     <w:pPr>
-      <w:spacing w:before="36" w:after="36"/>
+      <w:spacing w:after="36" w:before="36"/>
     </w:pPr>
   </w:style>
-  <w:style w:type="paragraph" w:styleId="Title">
+  <w:style w:styleId="Title" w:type="paragraph">
     <w:name w:val="Title"/>
     <w:basedOn w:val="Normal"/>
     <w:next w:val="BodyText"/>
@@ -3214,24 +3211,24 @@
       <w:jc w:val="center"/>
     </w:pPr>
     <w:rPr>
-      <w:rFonts w:asciiTheme="majorHAnsi" w:eastAsiaTheme="majorEastAsia" w:hAnsiTheme="majorHAnsi" w:cstheme="majorBidi"/>
+      <w:rFonts w:asciiTheme="majorHAnsi" w:cstheme="majorBidi" w:eastAsiaTheme="majorEastAsia" w:hAnsiTheme="majorHAnsi"/>
       <w:sz w:val="56"/>
       <w:szCs w:val="56"/>
     </w:rPr>
   </w:style>
-  <w:style w:type="character" w:customStyle="1" w:styleId="TitleChar">
+  <w:style w:customStyle="1" w:styleId="TitleChar" w:type="character">
     <w:name w:val="Title Char"/>
     <w:basedOn w:val="DefaultParagraphFont"/>
     <w:link w:val="Title"/>
     <w:uiPriority w:val="10"/>
     <w:rsid w:val="00A10FD9"/>
     <w:rPr>
-      <w:rFonts w:asciiTheme="majorHAnsi" w:eastAsiaTheme="majorEastAsia" w:hAnsiTheme="majorHAnsi" w:cstheme="majorBidi"/>
+      <w:rFonts w:asciiTheme="majorHAnsi" w:cstheme="majorBidi" w:eastAsiaTheme="majorEastAsia" w:hAnsiTheme="majorHAnsi"/>
       <w:sz w:val="56"/>
       <w:szCs w:val="56"/>
     </w:rPr>
   </w:style>
-  <w:style w:type="paragraph" w:styleId="Subtitle">
+  <w:style w:styleId="Subtitle" w:type="paragraph">
     <w:name w:val="Subtitle"/>
     <w:basedOn w:val="Title"/>
     <w:next w:val="BodyText"/>
@@ -3245,27 +3242,27 @@
       </w:numPr>
     </w:pPr>
     <w:rPr>
-      <w:rFonts w:eastAsiaTheme="majorEastAsia" w:cstheme="majorBidi"/>
+      <w:rFonts w:cstheme="majorBidi" w:eastAsiaTheme="majorEastAsia"/>
       <w:spacing w:val="15"/>
       <w:sz w:val="28"/>
       <w:szCs w:val="28"/>
     </w:rPr>
   </w:style>
-  <w:style w:type="character" w:customStyle="1" w:styleId="SubtitleChar">
+  <w:style w:customStyle="1" w:styleId="SubtitleChar" w:type="character">
     <w:name w:val="Subtitle Char"/>
     <w:basedOn w:val="DefaultParagraphFont"/>
     <w:link w:val="Subtitle"/>
     <w:uiPriority w:val="11"/>
     <w:rsid w:val="00A10FD9"/>
     <w:rPr>
-      <w:rFonts w:eastAsiaTheme="majorEastAsia" w:cstheme="majorBidi"/>
-      <w:color w:val="595959" w:themeColor="text1" w:themeTint="A6"/>
+      <w:rFonts w:cstheme="majorBidi" w:eastAsiaTheme="majorEastAsia"/>
+      <w:color w:themeColor="text1" w:themeTint="A6" w:val="595959"/>
       <w:spacing w:val="15"/>
       <w:sz w:val="28"/>
       <w:szCs w:val="28"/>
     </w:rPr>
   </w:style>
-  <w:style w:type="paragraph" w:customStyle="1" w:styleId="Author">
+  <w:style w:customStyle="1" w:styleId="Author" w:type="paragraph">
     <w:name w:val="Author"/>
     <w:basedOn w:val="Title"/>
     <w:next w:val="BodyText"/>
@@ -3279,7 +3276,7 @@
       <w:szCs w:val="24"/>
     </w:rPr>
   </w:style>
-  <w:style w:type="paragraph" w:styleId="Date">
+  <w:style w:styleId="Date" w:type="paragraph">
     <w:name w:val="Date"/>
     <w:basedOn w:val="Title"/>
     <w:next w:val="BodyText"/>
@@ -3293,7 +3290,7 @@
       <w:szCs w:val="24"/>
     </w:rPr>
   </w:style>
-  <w:style w:type="paragraph" w:customStyle="1" w:styleId="AbstractTitle">
+  <w:style w:customStyle="1" w:styleId="AbstractTitle" w:type="paragraph">
     <w:name w:val="Abstract Title"/>
     <w:basedOn w:val="Normal"/>
     <w:next w:val="Abstract"/>
@@ -3301,7 +3298,7 @@
     <w:pPr>
       <w:keepNext/>
       <w:keepLines/>
-      <w:spacing w:before="300" w:after="0"/>
+      <w:spacing w:after="0" w:before="300"/>
       <w:jc w:val="center"/>
     </w:pPr>
     <w:rPr>
@@ -3310,7 +3307,7 @@
       <w:szCs w:val="20"/>
     </w:rPr>
   </w:style>
-  <w:style w:type="paragraph" w:customStyle="1" w:styleId="Abstract">
+  <w:style w:customStyle="1" w:styleId="Abstract" w:type="paragraph">
     <w:name w:val="Abstract"/>
     <w:basedOn w:val="Normal"/>
     <w:next w:val="BodyText"/>
@@ -3318,14 +3315,14 @@
     <w:pPr>
       <w:keepNext/>
       <w:keepLines/>
-      <w:spacing w:before="100" w:after="300"/>
+      <w:spacing w:after="300" w:before="100"/>
     </w:pPr>
     <w:rPr>
       <w:sz w:val="20"/>
       <w:szCs w:val="20"/>
     </w:rPr>
   </w:style>
-  <w:style w:type="paragraph" w:styleId="Bibliography">
+  <w:style w:styleId="Bibliography" w:type="paragraph">
     <w:name w:val="Bibliography"/>
     <w:basedOn w:val="Normal"/>
     <w:next w:val="Bibliography"/>
@@ -3333,7 +3330,7 @@
     <w:pPr/>
     <w:rPr/>
   </w:style>
-  <w:style w:type="paragraph" w:styleId="Heading1">
+  <w:style w:styleId="Heading1" w:type="paragraph">
     <w:name w:val="heading 1"/>
     <w:basedOn w:val="Normal"/>
     <w:next w:val="BodyText"/>
@@ -3344,17 +3341,17 @@
     <w:pPr>
       <w:keepNext/>
       <w:keepLines/>
-      <w:spacing w:before="360" w:after="80"/>
+      <w:spacing w:after="80" w:before="360"/>
       <w:outlineLvl w:val="0"/>
     </w:pPr>
     <w:rPr>
-      <w:rFonts w:asciiTheme="majorHAnsi" w:eastAsiaTheme="majorEastAsia" w:hAnsiTheme="majorHAnsi" w:cstheme="majorBidi"/>
-      <w:color w:val="0F4761" w:themeColor="accent1" w:themeShade="BF"/>
+      <w:rFonts w:asciiTheme="majorHAnsi" w:cstheme="majorBidi" w:eastAsiaTheme="majorEastAsia" w:hAnsiTheme="majorHAnsi"/>
+      <w:color w:themeColor="accent1" w:themeShade="BF" w:val="0F4761"/>
       <w:sz w:val="40"/>
       <w:szCs w:val="40"/>
     </w:rPr>
   </w:style>
-  <w:style w:type="paragraph" w:styleId="Heading2">
+  <w:style w:styleId="Heading2" w:type="paragraph">
     <w:name w:val="heading 2"/>
     <w:basedOn w:val="Normal"/>
     <w:next w:val="BodyText"/>
@@ -3367,17 +3364,17 @@
     <w:pPr>
       <w:keepNext/>
       <w:keepLines/>
-      <w:spacing w:before="160" w:after="80"/>
+      <w:spacing w:after="80" w:before="160"/>
       <w:outlineLvl w:val="1"/>
     </w:pPr>
     <w:rPr>
-      <w:rFonts w:asciiTheme="majorHAnsi" w:eastAsiaTheme="majorEastAsia" w:hAnsiTheme="majorHAnsi" w:cstheme="majorBidi"/>
-      <w:color w:val="0F4761" w:themeColor="accent1" w:themeShade="BF"/>
+      <w:rFonts w:asciiTheme="majorHAnsi" w:cstheme="majorBidi" w:eastAsiaTheme="majorEastAsia" w:hAnsiTheme="majorHAnsi"/>
+      <w:color w:themeColor="accent1" w:themeShade="BF" w:val="0F4761"/>
       <w:sz w:val="32"/>
       <w:szCs w:val="32"/>
     </w:rPr>
   </w:style>
-  <w:style w:type="paragraph" w:styleId="Heading3">
+  <w:style w:styleId="Heading3" w:type="paragraph">
     <w:name w:val="heading 3"/>
     <w:basedOn w:val="Normal"/>
     <w:next w:val="BodyText"/>
@@ -3390,17 +3387,17 @@
     <w:pPr>
       <w:keepNext/>
       <w:keepLines/>
-      <w:spacing w:before="160" w:after="80"/>
+      <w:spacing w:after="80" w:before="160"/>
       <w:outlineLvl w:val="2"/>
     </w:pPr>
     <w:rPr>
-      <w:rFonts w:eastAsiaTheme="majorEastAsia" w:cstheme="majorBidi"/>
-      <w:color w:val="0F4761" w:themeColor="accent1" w:themeShade="BF"/>
+      <w:rFonts w:cstheme="majorBidi" w:eastAsiaTheme="majorEastAsia"/>
+      <w:color w:themeColor="accent1" w:themeShade="BF" w:val="0F4761"/>
       <w:sz w:val="28"/>
       <w:szCs w:val="28"/>
     </w:rPr>
   </w:style>
-  <w:style w:type="paragraph" w:styleId="Heading4">
+  <w:style w:styleId="Heading4" w:type="paragraph">
     <w:name w:val="heading 4"/>
     <w:basedOn w:val="Normal"/>
     <w:next w:val="BodyText"/>
@@ -3413,17 +3410,17 @@
     <w:pPr>
       <w:keepNext/>
       <w:keepLines/>
-      <w:spacing w:before="80" w:after="40"/>
+      <w:spacing w:after="40" w:before="80"/>
       <w:outlineLvl w:val="3"/>
     </w:pPr>
     <w:rPr>
-      <w:rFonts w:eastAsiaTheme="majorEastAsia" w:cstheme="majorBidi"/>
+      <w:rFonts w:cstheme="majorBidi" w:eastAsiaTheme="majorEastAsia"/>
       <w:i/>
       <w:iCs/>
-      <w:color w:val="0F4761" w:themeColor="accent1" w:themeShade="BF"/>
-    </w:rPr>
-  </w:style>
-  <w:style w:type="paragraph" w:styleId="Heading5">
+      <w:color w:themeColor="accent1" w:themeShade="BF" w:val="0F4761"/>
+    </w:rPr>
+  </w:style>
+  <w:style w:styleId="Heading5" w:type="paragraph">
     <w:name w:val="heading 5"/>
     <w:basedOn w:val="Normal"/>
     <w:next w:val="BodyText"/>
@@ -3436,15 +3433,15 @@
     <w:pPr>
       <w:keepNext/>
       <w:keepLines/>
-      <w:spacing w:before="80" w:after="40"/>
+      <w:spacing w:after="40" w:before="80"/>
       <w:outlineLvl w:val="4"/>
     </w:pPr>
     <w:rPr>
-      <w:rFonts w:eastAsiaTheme="majorEastAsia" w:cstheme="majorBidi"/>
-      <w:color w:val="0F4761" w:themeColor="accent1" w:themeShade="BF"/>
-    </w:rPr>
-  </w:style>
-  <w:style w:type="paragraph" w:styleId="Heading6">
+      <w:rFonts w:cstheme="majorBidi" w:eastAsiaTheme="majorEastAsia"/>
+      <w:color w:themeColor="accent1" w:themeShade="BF" w:val="0F4761"/>
+    </w:rPr>
+  </w:style>
+  <w:style w:styleId="Heading6" w:type="paragraph">
     <w:name w:val="heading 6"/>
     <w:basedOn w:val="Normal"/>
     <w:next w:val="BodyText"/>
@@ -3457,17 +3454,17 @@
     <w:pPr>
       <w:keepNext/>
       <w:keepLines/>
-      <w:spacing w:before="40" w:after="0"/>
+      <w:spacing w:after="0" w:before="40"/>
       <w:outlineLvl w:val="5"/>
     </w:pPr>
     <w:rPr>
-      <w:rFonts w:eastAsiaTheme="majorEastAsia" w:cstheme="majorBidi"/>
+      <w:rFonts w:cstheme="majorBidi" w:eastAsiaTheme="majorEastAsia"/>
       <w:i/>
       <w:iCs/>
-      <w:color w:val="595959" w:themeColor="text1" w:themeTint="A6"/>
-    </w:rPr>
-  </w:style>
-  <w:style w:type="paragraph" w:styleId="Heading7">
+      <w:color w:themeColor="text1" w:themeTint="A6" w:val="595959"/>
+    </w:rPr>
+  </w:style>
+  <w:style w:styleId="Heading7" w:type="paragraph">
     <w:name w:val="heading 7"/>
     <w:basedOn w:val="Normal"/>
     <w:next w:val="BodyText"/>
@@ -3480,15 +3477,15 @@
     <w:pPr>
       <w:keepNext/>
       <w:keepLines/>
-      <w:spacing w:before="40" w:after="0"/>
+      <w:spacing w:after="0" w:before="40"/>
       <w:outlineLvl w:val="6"/>
     </w:pPr>
     <w:rPr>
-      <w:rFonts w:eastAsiaTheme="majorEastAsia" w:cstheme="majorBidi"/>
-      <w:color w:val="595959" w:themeColor="text1" w:themeTint="A6"/>
-    </w:rPr>
-  </w:style>
-  <w:style w:type="paragraph" w:styleId="Heading8">
+      <w:rFonts w:cstheme="majorBidi" w:eastAsiaTheme="majorEastAsia"/>
+      <w:color w:themeColor="text1" w:themeTint="A6" w:val="595959"/>
+    </w:rPr>
+  </w:style>
+  <w:style w:styleId="Heading8" w:type="paragraph">
     <w:name w:val="heading 8"/>
     <w:basedOn w:val="Normal"/>
     <w:next w:val="BodyText"/>
@@ -3505,13 +3502,13 @@
       <w:outlineLvl w:val="7"/>
     </w:pPr>
     <w:rPr>
-      <w:rFonts w:eastAsiaTheme="majorEastAsia" w:cstheme="majorBidi"/>
+      <w:rFonts w:cstheme="majorBidi" w:eastAsiaTheme="majorEastAsia"/>
       <w:i/>
       <w:iCs/>
-      <w:color w:val="272727" w:themeColor="text1" w:themeTint="D8"/>
-    </w:rPr>
-  </w:style>
-  <w:style w:type="paragraph" w:styleId="Heading9">
+      <w:color w:themeColor="text1" w:themeTint="D8" w:val="272727"/>
+    </w:rPr>
+  </w:style>
+  <w:style w:styleId="Heading9" w:type="paragraph">
     <w:name w:val="heading 9"/>
     <w:basedOn w:val="Normal"/>
     <w:next w:val="BodyText"/>
@@ -3528,24 +3525,24 @@
       <w:outlineLvl w:val="8"/>
     </w:pPr>
     <w:rPr>
-      <w:rFonts w:eastAsiaTheme="majorEastAsia" w:cstheme="majorBidi"/>
-      <w:color w:val="272727" w:themeColor="text1" w:themeTint="D8"/>
-    </w:rPr>
-  </w:style>
-  <w:style w:type="character" w:customStyle="1" w:styleId="Heading1Char">
+      <w:rFonts w:cstheme="majorBidi" w:eastAsiaTheme="majorEastAsia"/>
+      <w:color w:themeColor="text1" w:themeTint="D8" w:val="272727"/>
+    </w:rPr>
+  </w:style>
+  <w:style w:customStyle="1" w:styleId="Heading1Char" w:type="character">
     <w:name w:val="Heading 1 Char"/>
     <w:basedOn w:val="DefaultParagraphFont"/>
     <w:link w:val="Heading1"/>
     <w:uiPriority w:val="9"/>
     <w:rsid w:val="00A10FD9"/>
     <w:rPr>
-      <w:rFonts w:asciiTheme="majorHAnsi" w:eastAsiaTheme="majorEastAsia" w:hAnsiTheme="majorHAnsi" w:cstheme="majorBidi"/>
-      <w:color w:val="0F4761" w:themeColor="accent1" w:themeShade="BF"/>
+      <w:rFonts w:asciiTheme="majorHAnsi" w:cstheme="majorBidi" w:eastAsiaTheme="majorEastAsia" w:hAnsiTheme="majorHAnsi"/>
+      <w:color w:themeColor="accent1" w:themeShade="BF" w:val="0F4761"/>
       <w:sz w:val="40"/>
       <w:szCs w:val="40"/>
     </w:rPr>
   </w:style>
-  <w:style w:type="character" w:customStyle="1" w:styleId="Heading2Char">
+  <w:style w:customStyle="1" w:styleId="Heading2Char" w:type="character">
     <w:name w:val="Heading 2 Char"/>
     <w:basedOn w:val="DefaultParagraphFont"/>
     <w:link w:val="Heading2"/>
@@ -3553,13 +3550,13 @@
     <w:semiHidden/>
     <w:rsid w:val="00A10FD9"/>
     <w:rPr>
-      <w:rFonts w:asciiTheme="majorHAnsi" w:eastAsiaTheme="majorEastAsia" w:hAnsiTheme="majorHAnsi" w:cstheme="majorBidi"/>
-      <w:color w:val="0F4761" w:themeColor="accent1" w:themeShade="BF"/>
+      <w:rFonts w:asciiTheme="majorHAnsi" w:cstheme="majorBidi" w:eastAsiaTheme="majorEastAsia" w:hAnsiTheme="majorHAnsi"/>
+      <w:color w:themeColor="accent1" w:themeShade="BF" w:val="0F4761"/>
       <w:sz w:val="32"/>
       <w:szCs w:val="32"/>
     </w:rPr>
   </w:style>
-  <w:style w:type="character" w:customStyle="1" w:styleId="Heading3Char">
+  <w:style w:customStyle="1" w:styleId="Heading3Char" w:type="character">
     <w:name w:val="Heading 3 Char"/>
     <w:basedOn w:val="DefaultParagraphFont"/>
     <w:link w:val="Heading3"/>
@@ -3567,13 +3564,13 @@
     <w:semiHidden/>
     <w:rsid w:val="00A10FD9"/>
     <w:rPr>
-      <w:rFonts w:eastAsiaTheme="majorEastAsia" w:cstheme="majorBidi"/>
-      <w:color w:val="0F4761" w:themeColor="accent1" w:themeShade="BF"/>
+      <w:rFonts w:cstheme="majorBidi" w:eastAsiaTheme="majorEastAsia"/>
+      <w:color w:themeColor="accent1" w:themeShade="BF" w:val="0F4761"/>
       <w:sz w:val="28"/>
       <w:szCs w:val="28"/>
     </w:rPr>
   </w:style>
-  <w:style w:type="character" w:customStyle="1" w:styleId="Heading4Char">
+  <w:style w:customStyle="1" w:styleId="Heading4Char" w:type="character">
     <w:name w:val="Heading 4 Char"/>
     <w:basedOn w:val="DefaultParagraphFont"/>
     <w:link w:val="Heading4"/>
@@ -3581,13 +3578,13 @@
     <w:semiHidden/>
     <w:rsid w:val="00A10FD9"/>
     <w:rPr>
-      <w:rFonts w:eastAsiaTheme="majorEastAsia" w:cstheme="majorBidi"/>
+      <w:rFonts w:cstheme="majorBidi" w:eastAsiaTheme="majorEastAsia"/>
       <w:i/>
       <w:iCs/>
-      <w:color w:val="0F4761" w:themeColor="accent1" w:themeShade="BF"/>
-    </w:rPr>
-  </w:style>
-  <w:style w:type="character" w:customStyle="1" w:styleId="Heading5Char">
+      <w:color w:themeColor="accent1" w:themeShade="BF" w:val="0F4761"/>
+    </w:rPr>
+  </w:style>
+  <w:style w:customStyle="1" w:styleId="Heading5Char" w:type="character">
     <w:name w:val="Heading 5 Char"/>
     <w:basedOn w:val="DefaultParagraphFont"/>
     <w:link w:val="Heading5"/>
@@ -3595,11 +3592,11 @@
     <w:semiHidden/>
     <w:rsid w:val="00A10FD9"/>
     <w:rPr>
-      <w:rFonts w:eastAsiaTheme="majorEastAsia" w:cstheme="majorBidi"/>
-      <w:color w:val="0F4761" w:themeColor="accent1" w:themeShade="BF"/>
-    </w:rPr>
-  </w:style>
-  <w:style w:type="character" w:customStyle="1" w:styleId="Heading6Char">
+      <w:rFonts w:cstheme="majorBidi" w:eastAsiaTheme="majorEastAsia"/>
+      <w:color w:themeColor="accent1" w:themeShade="BF" w:val="0F4761"/>
+    </w:rPr>
+  </w:style>
+  <w:style w:customStyle="1" w:styleId="Heading6Char" w:type="character">
     <w:name w:val="Heading 6 Char"/>
     <w:basedOn w:val="DefaultParagraphFont"/>
     <w:link w:val="Heading6"/>
@@ -3607,13 +3604,13 @@
     <w:semiHidden/>
     <w:rsid w:val="00A10FD9"/>
     <w:rPr>
-      <w:rFonts w:eastAsiaTheme="majorEastAsia" w:cstheme="majorBidi"/>
+      <w:rFonts w:cstheme="majorBidi" w:eastAsiaTheme="majorEastAsia"/>
       <w:i/>
       <w:iCs/>
-      <w:color w:val="595959" w:themeColor="text1" w:themeTint="A6"/>
-    </w:rPr>
-  </w:style>
-  <w:style w:type="character" w:customStyle="1" w:styleId="Heading7Char">
+      <w:color w:themeColor="text1" w:themeTint="A6" w:val="595959"/>
+    </w:rPr>
+  </w:style>
+  <w:style w:customStyle="1" w:styleId="Heading7Char" w:type="character">
     <w:name w:val="Heading 7 Char"/>
     <w:basedOn w:val="DefaultParagraphFont"/>
     <w:link w:val="Heading7"/>
@@ -3621,11 +3618,11 @@
     <w:semiHidden/>
     <w:rsid w:val="00A10FD9"/>
     <w:rPr>
-      <w:rFonts w:eastAsiaTheme="majorEastAsia" w:cstheme="majorBidi"/>
-      <w:color w:val="595959" w:themeColor="text1" w:themeTint="A6"/>
-    </w:rPr>
-  </w:style>
-  <w:style w:type="character" w:customStyle="1" w:styleId="Heading8Char">
+      <w:rFonts w:cstheme="majorBidi" w:eastAsiaTheme="majorEastAsia"/>
+      <w:color w:themeColor="text1" w:themeTint="A6" w:val="595959"/>
+    </w:rPr>
+  </w:style>
+  <w:style w:customStyle="1" w:styleId="Heading8Char" w:type="character">
     <w:name w:val="Heading 8 Char"/>
     <w:basedOn w:val="DefaultParagraphFont"/>
     <w:link w:val="Heading8"/>
@@ -3633,13 +3630,13 @@
     <w:semiHidden/>
     <w:rsid w:val="00A10FD9"/>
     <w:rPr>
-      <w:rFonts w:eastAsiaTheme="majorEastAsia" w:cstheme="majorBidi"/>
+      <w:rFonts w:cstheme="majorBidi" w:eastAsiaTheme="majorEastAsia"/>
       <w:i/>
       <w:iCs/>
-      <w:color w:val="272727" w:themeColor="text1" w:themeTint="D8"/>
-    </w:rPr>
-  </w:style>
-  <w:style w:type="character" w:customStyle="1" w:styleId="Heading9Char">
+      <w:color w:themeColor="text1" w:themeTint="D8" w:val="272727"/>
+    </w:rPr>
+  </w:style>
+  <w:style w:customStyle="1" w:styleId="Heading9Char" w:type="character">
     <w:name w:val="Heading 9 Char"/>
     <w:basedOn w:val="DefaultParagraphFont"/>
     <w:link w:val="Heading9"/>
@@ -3647,11 +3644,11 @@
     <w:semiHidden/>
     <w:rsid w:val="00A10FD9"/>
     <w:rPr>
-      <w:rFonts w:eastAsiaTheme="majorEastAsia" w:cstheme="majorBidi"/>
-      <w:color w:val="272727" w:themeColor="text1" w:themeTint="D8"/>
-    </w:rPr>
-  </w:style>
-  <w:style w:type="paragraph" w:styleId="BlockText">
+      <w:rFonts w:cstheme="majorBidi" w:eastAsiaTheme="majorEastAsia"/>
+      <w:color w:themeColor="text1" w:themeTint="D8" w:val="272727"/>
+    </w:rPr>
+  </w:style>
+  <w:style w:styleId="BlockText" w:type="paragraph">
     <w:name w:val="Block Text"/>
     <w:basedOn w:val="BodyText"/>
     <w:next w:val="BodyText"/>
@@ -3659,11 +3656,11 @@
     <w:unhideWhenUsed/>
     <w:qFormat/>
     <w:pPr>
-      <w:spacing w:before="100" w:after="100"/>
+      <w:spacing w:after="100" w:before="100"/>
       <w:ind w:firstLine="0" w:left="480" w:right="480"/>
     </w:pPr>
   </w:style>
-  <w:style w:type="paragraph" w:styleId="FootnoteText">
+  <w:style w:styleId="FootnoteText" w:type="paragraph">
     <w:name w:val="Footnote Text"/>
     <w:basedOn w:val="Normal"/>
     <w:next w:val="FootnoteText"/>
@@ -3671,7 +3668,7 @@
     <w:unhideWhenUsed/>
     <w:qFormat/>
   </w:style>
-  <w:style w:type="paragraph" w:styleId="FootnoteBlockText">
+  <w:style w:styleId="FootnoteBlockText" w:type="paragraph">
     <w:name w:val="Footnote Block Text"/>
     <w:basedOn w:val="FootnoteText"/>
     <w:next w:val="FootnoteText"/>
@@ -3679,29 +3676,38 @@
     <w:unhideWhenUsed/>
     <w:qFormat/>
     <w:pPr>
-      <w:spacing w:before="100" w:after="100"/>
+      <w:spacing w:after="100" w:before="100"/>
       <w:ind w:firstLine="0" w:left="480" w:right="480"/>
     </w:pPr>
   </w:style>
-  <w:style w:type="character" w:default="1" w:styleId="DefaultParagraphFont">
+  <w:style w:default="1" w:styleId="DefaultParagraphFont" w:type="character">
     <w:name w:val="Default Paragraph Font"/>
     <w:semiHidden/>
     <w:unhideWhenUsed/>
   </w:style>
-  <w:style w:type="table" w:default="1" w:styleId="Table">
+  <w:style w:default="1" w:styleId="Table" w:type="table">
     <w:name w:val="Table"/>
     <w:basedOn w:val="TableNormal"/>
+    <w:semiHidden/>
+    <w:unhideWhenUsed/>
     <w:qFormat/>
     <w:tblPr>
-      <w:tblInd w:w="0" w:type="dxa"/>
+      <w:tblInd w:type="dxa" w:w="0"/>
       <w:tblCellMar>
-        <w:top w:w="0" w:type="dxa"/>
-        <w:left w:w="108" w:type="dxa"/>
-        <w:bottom w:w="0" w:type="dxa"/>
-        <w:right w:w="108" w:type="dxa"/>
+        <w:top w:type="dxa" w:w="0"/>
+        <w:left w:type="dxa" w:w="108"/>
+        <w:bottom w:type="dxa" w:w="0"/>
+        <w:right w:type="dxa" w:w="108"/>
       </w:tblCellMar>
     </w:tblPr>
     <w:tblStylePr w:type="firstRow">
+      <w:tblPr>
+        <w:jc w:val="left"/>
+        <w:tblInd w:type="dxa" w:w="0"/>
+      </w:tblPr>
+      <w:trPr>
+        <w:jc w:val="left"/>
+      </w:trPr>
       <w:tcPr>
         <w:tcBorders>
           <w:bottom w:val="single"/>
@@ -3710,7 +3716,7 @@
       </w:tcPr>
     </w:tblStylePr>
   </w:style>
-  <w:style w:type="paragraph" w:customStyle="1" w:styleId="DefinitionTerm">
+  <w:style w:customStyle="1" w:styleId="DefinitionTerm" w:type="paragraph">
     <w:name w:val="Definition Term"/>
     <w:basedOn w:val="Normal"/>
     <w:next w:val="Definition"/>
@@ -3723,49 +3729,49 @@
       <w:b/>
     </w:rPr>
   </w:style>
-  <w:style w:type="paragraph" w:customStyle="1" w:styleId="Definition">
+  <w:style w:customStyle="1" w:styleId="Definition" w:type="paragraph">
     <w:name w:val="Definition"/>
     <w:basedOn w:val="Normal"/>
   </w:style>
-  <w:style w:type="paragraph" w:styleId="Caption">
+  <w:style w:styleId="Caption" w:type="paragraph">
     <w:name w:val="Caption"/>
     <w:basedOn w:val="Normal"/>
     <w:link w:val="BodyTextChar"/>
     <w:pPr>
-      <w:spacing w:before="0" w:after="120"/>
+      <w:spacing w:after="120" w:before="0"/>
     </w:pPr>
     <w:rPr>
       <w:i/>
     </w:rPr>
   </w:style>
-  <w:style w:type="paragraph" w:customStyle="1" w:styleId="TableCaption">
+  <w:style w:customStyle="1" w:styleId="TableCaption" w:type="paragraph">
     <w:name w:val="Table Caption"/>
     <w:basedOn w:val="Caption"/>
     <w:pPr>
       <w:keepNext/>
     </w:pPr>
   </w:style>
-  <w:style w:type="paragraph" w:customStyle="1" w:styleId="ImageCaption">
+  <w:style w:customStyle="1" w:styleId="ImageCaption" w:type="paragraph">
     <w:name w:val="Image Caption"/>
     <w:basedOn w:val="Caption"/>
   </w:style>
-  <w:style w:type="paragraph" w:customStyle="1" w:styleId="Figure">
+  <w:style w:customStyle="1" w:styleId="Figure" w:type="paragraph">
     <w:name w:val="Figure"/>
     <w:basedOn w:val="Normal"/>
   </w:style>
-  <w:style w:type="paragraph" w:customStyle="1" w:styleId="CaptionedFigure">
+  <w:style w:customStyle="1" w:styleId="CaptionedFigure" w:type="paragraph">
     <w:name w:val="Captioned Figure"/>
     <w:basedOn w:val="Figure"/>
     <w:pPr>
       <w:keepNext/>
     </w:pPr>
   </w:style>
-  <w:style w:type="character" w:customStyle="1" w:styleId="BodyTextChar">
+  <w:style w:customStyle="1" w:styleId="BodyTextChar" w:type="character">
     <w:name w:val="Body Text Char"/>
     <w:basedOn w:val="DefaultParagraphFont"/>
     <w:link w:val="BodyText"/>
   </w:style>
-  <w:style w:type="character" w:customStyle="1" w:styleId="VerbatimChar">
+  <w:style w:customStyle="1" w:styleId="VerbatimChar" w:type="character">
     <w:name w:val="Verbatim Char"/>
     <w:basedOn w:val="BodyTextChar"/>
     <w:rPr>
@@ -3773,25 +3779,25 @@
       <w:sz w:val="22"/>
     </w:rPr>
   </w:style>
-  <w:style w:type="character" w:customStyle="1" w:styleId="SectionNumber">
+  <w:style w:customStyle="1" w:styleId="SectionNumber" w:type="character">
     <w:name w:val="Section Number"/>
     <w:basedOn w:val="BodyTextChar"/>
   </w:style>
-  <w:style w:type="character" w:styleId="FootnoteReference">
+  <w:style w:styleId="FootnoteReference" w:type="character">
     <w:name w:val="Footnote Reference"/>
     <w:basedOn w:val="BodyTextChar"/>
     <w:rPr>
       <w:vertAlign w:val="superscript"/>
     </w:rPr>
   </w:style>
-  <w:style w:type="character" w:styleId="Hyperlink">
+  <w:style w:styleId="Hyperlink" w:type="character">
     <w:name w:val="Hyperlink"/>
     <w:basedOn w:val="BodyTextChar"/>
     <w:rPr>
-      <w:color w:val="4F81BD" w:themeColor="accent1"/>
-    </w:rPr>
-  </w:style>
-  <w:style w:type="paragraph" w:styleId="TOCHeading">
+      <w:color w:themeColor="accent1" w:val="4F81BD"/>
+    </w:rPr>
+  </w:style>
+  <w:style w:styleId="TOCHeading" w:type="paragraph">
     <w:name w:val="TOC Heading"/>
     <w:basedOn w:val="Heading1"/>
     <w:next w:val="BodyText"/>
@@ -3803,10 +3809,10 @@
       <w:outlineLvl w:val="9"/>
     </w:pPr>
     <w:rPr>
-      <w:rFonts w:asciiTheme="majorHAnsi" w:eastAsiaTheme="majorEastAsia" w:hAnsiTheme="majorHAnsi" w:cstheme="majorBidi"/>
+      <w:rFonts w:asciiTheme="majorHAnsi" w:cstheme="majorBidi" w:eastAsiaTheme="majorEastAsia" w:hAnsiTheme="majorHAnsi"/>
       <w:b w:val="0"/>
       <w:bCs w:val="0"/>
-      <w:color w:val="365F91" w:themeColor="accent1" w:themeShade="BF"/>
+      <w:color w:themeColor="accent1" w:themeShade="BF" w:val="365F91"/>
     </w:rPr>
   </w:style>
   <w:style w:type="paragraph" w:customStyle="1" w:styleId="SourceCode">

</xml_diff>